<commit_message>
Updated Documentation: some grammar improvements
</commit_message>
<xml_diff>
--- a/Documentation_Draft.docx
+++ b/Documentation_Draft.docx
@@ -4,78 +4,72 @@
   <w:body>
     <w:p>
       <w:pPr>
-        <w:pStyle w:val="MainHeader"/>
-      </w:pPr>
-      <w:r>
-        <w:t xml:space="preserve">Preparing art &amp; resources for developing </w:t>
-      </w:r>
-      <w:proofErr w:type="gramStart"/>
-      <w:r>
-        <w:t>environment</w:t>
-      </w:r>
-      <w:proofErr w:type="gramEnd"/>
-    </w:p>
-    <w:p>
-      <w:pPr>
         <w:spacing w:line="360" w:lineRule="auto"/>
+        <w:jc w:val="center"/>
+        <w:rPr>
+          <w:rFonts w:ascii="Calibri" w:hAnsi="Calibri" w:cs="Calibri"/>
+          <w:b/>
+          <w:bCs/>
+          <w:sz w:val="52"/>
+          <w:szCs w:val="52"/>
+          <w:lang w:val="uk-UA"/>
+        </w:rPr>
+      </w:pPr>
+      <w:r>
+        <w:rPr>
+          <w:rFonts w:ascii="Calibri" w:hAnsi="Calibri" w:cs="Calibri"/>
+          <w:b/>
+          <w:bCs/>
+          <w:sz w:val="52"/>
+          <w:szCs w:val="52"/>
+        </w:rPr>
+        <w:t>Preparing Art &amp; Resources for the</w:t>
+      </w:r>
+      <w:r>
+        <w:rPr>
+          <w:rFonts w:ascii="Calibri" w:hAnsi="Calibri" w:cs="Calibri"/>
+          <w:b/>
+          <w:bCs/>
+          <w:sz w:val="52"/>
+          <w:szCs w:val="52"/>
+        </w:rPr>
+        <w:t xml:space="preserve"> </w:t>
+      </w:r>
+      <w:r>
+        <w:rPr>
+          <w:rFonts w:ascii="Calibri" w:hAnsi="Calibri" w:cs="Calibri"/>
+          <w:b/>
+          <w:bCs/>
+          <w:sz w:val="52"/>
+          <w:szCs w:val="52"/>
+        </w:rPr>
+        <w:t>Development Environment</w:t>
+      </w:r>
+    </w:p>
+    <w:p>
+      <w:pPr>
+        <w:pStyle w:val="TOCHeading"/>
         <w:ind w:firstLine="720"/>
-        <w:rPr>
-          <w:rFonts w:ascii="Calibri" w:hAnsi="Calibri" w:cs="Calibri"/>
-        </w:rPr>
-      </w:pPr>
-      <w:r>
-        <w:rPr>
-          <w:rFonts w:ascii="Calibri" w:hAnsi="Calibri" w:cs="Calibri"/>
-        </w:rPr>
-        <w:t xml:space="preserve">This documentation describes a list of </w:t>
-      </w:r>
-      <w:r>
-        <w:rPr>
-          <w:rFonts w:ascii="Calibri" w:hAnsi="Calibri" w:cs="Calibri"/>
-        </w:rPr>
-        <w:t>purposes</w:t>
-      </w:r>
-      <w:r>
-        <w:rPr>
-          <w:rFonts w:ascii="Calibri" w:hAnsi="Calibri" w:cs="Calibri"/>
-        </w:rPr>
-        <w:t xml:space="preserve"> and recommendations </w:t>
-      </w:r>
-      <w:r>
-        <w:rPr>
-          <w:rFonts w:ascii="Calibri" w:hAnsi="Calibri" w:cs="Calibri"/>
-        </w:rPr>
-        <w:t>for</w:t>
-      </w:r>
-      <w:r>
-        <w:rPr>
-          <w:rFonts w:ascii="Calibri" w:hAnsi="Calibri" w:cs="Calibri"/>
-        </w:rPr>
-        <w:t xml:space="preserve"> preparing resources </w:t>
-      </w:r>
-      <w:r>
-        <w:rPr>
-          <w:rFonts w:ascii="Calibri" w:hAnsi="Calibri" w:cs="Calibri"/>
-        </w:rPr>
-        <w:t xml:space="preserve">in Adobe Photoshop </w:t>
-      </w:r>
-      <w:r>
-        <w:rPr>
-          <w:rFonts w:ascii="Calibri" w:hAnsi="Calibri" w:cs="Calibri"/>
-        </w:rPr>
-        <w:t xml:space="preserve">for </w:t>
-      </w:r>
-      <w:r>
-        <w:rPr>
-          <w:rFonts w:ascii="Calibri" w:hAnsi="Calibri" w:cs="Calibri"/>
-        </w:rPr>
-        <w:t>tools</w:t>
-      </w:r>
-      <w:r>
-        <w:rPr>
-          <w:rFonts w:ascii="Calibri" w:hAnsi="Calibri" w:cs="Calibri"/>
-        </w:rPr>
-        <w:t>, such as Adobe Animate and Spine.</w:t>
+        <w:jc w:val="left"/>
+        <w:rPr>
+          <w:rFonts w:eastAsiaTheme="minorHAnsi" w:cs="Calibri"/>
+          <w:color w:val="auto"/>
+          <w:kern w:val="2"/>
+          <w:sz w:val="24"/>
+          <w:szCs w:val="24"/>
+          <w14:ligatures w14:val="standardContextual"/>
+        </w:rPr>
+      </w:pPr>
+      <w:r>
+        <w:rPr>
+          <w:rFonts w:eastAsiaTheme="minorHAnsi" w:cs="Calibri"/>
+          <w:color w:val="auto"/>
+          <w:kern w:val="2"/>
+          <w:sz w:val="24"/>
+          <w:szCs w:val="24"/>
+          <w14:ligatures w14:val="standardContextual"/>
+        </w:rPr>
+        <w:t>This documentation outlines the goals and best practices for preparing resources in Adobe Photoshop for integration with tools such as Adobe Animate and Spine.</w:t>
       </w:r>
     </w:p>
     <w:sdt>
@@ -1703,6 +1697,27 @@
         <w:t>Adobe Photoshop art preparation</w:t>
       </w:r>
       <w:bookmarkEnd w:id="0"/>
+    </w:p>
+    <w:p>
+      <w:pPr>
+        <w:rPr>
+          <w:rFonts w:ascii="Calibri" w:hAnsi="Calibri" w:cs="Calibri"/>
+          <w:b/>
+          <w:bCs/>
+          <w:sz w:val="28"/>
+          <w:szCs w:val="28"/>
+        </w:rPr>
+      </w:pPr>
+      <w:r>
+        <w:rPr>
+          <w:rFonts w:ascii="Calibri" w:hAnsi="Calibri" w:cs="Calibri"/>
+          <w:b/>
+          <w:bCs/>
+          <w:sz w:val="28"/>
+          <w:szCs w:val="28"/>
+        </w:rPr>
+        <w:t>Creating a New Project Document</w:t>
+      </w:r>
     </w:p>
     <w:p>
       <w:pPr>
@@ -1831,8 +1846,10 @@
       <w:r>
         <w:rPr>
           <w:rFonts w:ascii="Calibri" w:hAnsi="Calibri" w:cs="Calibri"/>
-        </w:rPr>
-        <w:t xml:space="preserve">Do </w:t>
+          <w:b/>
+          <w:bCs/>
+        </w:rPr>
+        <w:t xml:space="preserve">Avoid using </w:t>
       </w:r>
       <w:r>
         <w:rPr>
@@ -1841,42 +1858,166 @@
           <w:bCs/>
           <w:color w:val="FF0000"/>
         </w:rPr>
-        <w:t xml:space="preserve">not create </w:t>
-      </w:r>
-      <w:r>
-        <w:rPr>
-          <w:rFonts w:ascii="Calibri" w:hAnsi="Calibri" w:cs="Calibri"/>
-          <w:b/>
-          <w:bCs/>
-          <w:color w:val="FF0000"/>
-        </w:rPr>
-        <w:t>a big</w:t>
-      </w:r>
-      <w:r>
-        <w:rPr>
-          <w:rFonts w:ascii="Calibri" w:hAnsi="Calibri" w:cs="Calibri"/>
-          <w:color w:val="FF0000"/>
+        <w:t xml:space="preserve">unnecessarily large </w:t>
+      </w:r>
+      <w:r>
+        <w:rPr>
+          <w:rFonts w:ascii="Calibri" w:hAnsi="Calibri" w:cs="Calibri"/>
+          <w:b/>
+          <w:bCs/>
+        </w:rPr>
+        <w:t xml:space="preserve">canvas </w:t>
+      </w:r>
+      <w:r>
+        <w:rPr>
+          <w:rFonts w:ascii="Calibri" w:hAnsi="Calibri" w:cs="Calibri"/>
+          <w:b/>
+          <w:bCs/>
+        </w:rPr>
+        <w:t>sizes</w:t>
+      </w:r>
+      <w:r>
+        <w:rPr>
+          <w:rFonts w:ascii="Calibri" w:hAnsi="Calibri" w:cs="Calibri"/>
+        </w:rPr>
+        <w:t xml:space="preserve">, </w:t>
+      </w:r>
+      <w:r>
+        <w:rPr>
+          <w:rFonts w:ascii="Calibri" w:hAnsi="Calibri" w:cs="Calibri"/>
+        </w:rPr>
+        <w:t>for example, small UI elements like buttons do not require high-resolution documents.</w:t>
+      </w:r>
+    </w:p>
+    <w:p>
+      <w:pPr>
+        <w:spacing w:line="360" w:lineRule="auto"/>
+        <w:rPr>
+          <w:rFonts w:ascii="Calibri" w:hAnsi="Calibri" w:cs="Calibri"/>
+        </w:rPr>
+      </w:pPr>
+      <w:r>
+        <w:rPr>
+          <w:rFonts w:ascii="Calibri" w:hAnsi="Calibri" w:cs="Calibri"/>
+        </w:rPr>
+        <w:t xml:space="preserve">For most </w:t>
+      </w:r>
+      <w:r>
+        <w:rPr>
+          <w:rFonts w:ascii="Calibri" w:hAnsi="Calibri" w:cs="Calibri"/>
+          <w:b/>
+          <w:bCs/>
+        </w:rPr>
+        <w:t>Bitmap</w:t>
+      </w:r>
+      <w:r>
+        <w:rPr>
+          <w:rFonts w:ascii="Calibri" w:hAnsi="Calibri" w:cs="Calibri"/>
+        </w:rPr>
+        <w:t xml:space="preserve"> projects use </w:t>
+      </w:r>
+      <w:r>
+        <w:rPr>
+          <w:rFonts w:ascii="Calibri" w:hAnsi="Calibri" w:cs="Calibri"/>
+          <w:b/>
+          <w:bCs/>
+        </w:rPr>
+        <w:t>Resolution 72</w:t>
+      </w:r>
+      <w:r>
+        <w:rPr>
+          <w:rFonts w:ascii="Calibri" w:hAnsi="Calibri" w:cs="Calibri"/>
+          <w:b/>
+          <w:bCs/>
+        </w:rPr>
+        <w:t xml:space="preserve"> PPI.</w:t>
+      </w:r>
+    </w:p>
+    <w:p>
+      <w:pPr>
+        <w:spacing w:line="360" w:lineRule="auto"/>
+        <w:rPr>
+          <w:rFonts w:ascii="Calibri" w:hAnsi="Calibri" w:cs="Calibri"/>
+          <w:b/>
+          <w:bCs/>
+        </w:rPr>
+      </w:pPr>
+      <w:r>
+        <w:rPr>
+          <w:rFonts w:ascii="Calibri" w:hAnsi="Calibri" w:cs="Calibri"/>
+        </w:rPr>
+        <w:t xml:space="preserve">For </w:t>
+      </w:r>
+      <w:r>
+        <w:rPr>
+          <w:rFonts w:ascii="Calibri" w:hAnsi="Calibri" w:cs="Calibri"/>
+          <w:b/>
+          <w:bCs/>
+        </w:rPr>
+        <w:t xml:space="preserve">Vector </w:t>
+      </w:r>
+      <w:r>
+        <w:rPr>
+          <w:rFonts w:ascii="Calibri" w:hAnsi="Calibri" w:cs="Calibri"/>
+        </w:rPr>
+        <w:t xml:space="preserve">image projects use </w:t>
+      </w:r>
+      <w:r>
+        <w:rPr>
+          <w:rFonts w:ascii="Calibri" w:hAnsi="Calibri" w:cs="Calibri"/>
+          <w:b/>
+          <w:bCs/>
+        </w:rPr>
+        <w:t>Resolution 300</w:t>
+      </w:r>
+      <w:r>
+        <w:rPr>
+          <w:rFonts w:ascii="Calibri" w:hAnsi="Calibri" w:cs="Calibri"/>
+          <w:b/>
+          <w:bCs/>
+        </w:rPr>
+        <w:t xml:space="preserve"> PPI</w:t>
+      </w:r>
+    </w:p>
+    <w:p>
+      <w:pPr>
+        <w:spacing w:line="360" w:lineRule="auto"/>
+        <w:rPr>
+          <w:rFonts w:ascii="Calibri" w:hAnsi="Calibri" w:cs="Calibri"/>
+          <w:b/>
+          <w:bCs/>
+        </w:rPr>
+      </w:pPr>
+      <w:r>
+        <w:rPr>
+          <w:rFonts w:ascii="Calibri" w:hAnsi="Calibri" w:cs="Calibri"/>
+        </w:rPr>
+        <w:t>Use</w:t>
+      </w:r>
+      <w:r>
+        <w:rPr>
+          <w:rFonts w:ascii="Calibri" w:hAnsi="Calibri" w:cs="Calibri"/>
+          <w:b/>
+          <w:bCs/>
+        </w:rPr>
+        <w:t xml:space="preserve"> Color mode →</w:t>
+      </w:r>
+      <w:r>
+        <w:rPr>
+          <w:rFonts w:ascii="Calibri" w:hAnsi="Calibri" w:cs="Calibri"/>
+          <w:b/>
+          <w:bCs/>
+          <w:lang w:val="uk-UA"/>
         </w:rPr>
         <w:t xml:space="preserve"> </w:t>
       </w:r>
       <w:r>
         <w:rPr>
           <w:rFonts w:ascii="Calibri" w:hAnsi="Calibri" w:cs="Calibri"/>
-        </w:rPr>
-        <w:t>document if your resources do not require it.</w:t>
-      </w:r>
-      <w:r>
-        <w:rPr>
-          <w:rFonts w:ascii="Calibri" w:hAnsi="Calibri" w:cs="Calibri"/>
-          <w:lang w:val="uk-UA"/>
-        </w:rPr>
-        <w:t xml:space="preserve"> </w:t>
-      </w:r>
-      <w:r>
-        <w:rPr>
-          <w:rFonts w:ascii="Calibri" w:hAnsi="Calibri" w:cs="Calibri"/>
-        </w:rPr>
-        <w:t>(for example, for small UI buttons)</w:t>
+          <w:b/>
+          <w:bCs/>
+        </w:rPr>
+        <w:t>RGB Color</w:t>
       </w:r>
     </w:p>
     <w:p>
@@ -1884,120 +2025,8 @@
         <w:spacing w:line="360" w:lineRule="auto"/>
         <w:rPr>
           <w:rFonts w:ascii="Calibri" w:hAnsi="Calibri" w:cs="Calibri"/>
-        </w:rPr>
-      </w:pPr>
-      <w:r>
-        <w:rPr>
-          <w:rFonts w:ascii="Calibri" w:hAnsi="Calibri" w:cs="Calibri"/>
-        </w:rPr>
-        <w:t xml:space="preserve">For most </w:t>
-      </w:r>
-      <w:r>
-        <w:rPr>
-          <w:rFonts w:ascii="Calibri" w:hAnsi="Calibri" w:cs="Calibri"/>
-          <w:b/>
-          <w:bCs/>
-        </w:rPr>
-        <w:t>Bitmap</w:t>
-      </w:r>
-      <w:r>
-        <w:rPr>
-          <w:rFonts w:ascii="Calibri" w:hAnsi="Calibri" w:cs="Calibri"/>
-        </w:rPr>
-        <w:t xml:space="preserve"> projects use </w:t>
-      </w:r>
-      <w:r>
-        <w:rPr>
-          <w:rFonts w:ascii="Calibri" w:hAnsi="Calibri" w:cs="Calibri"/>
-          <w:b/>
-          <w:bCs/>
-        </w:rPr>
-        <w:t>Resolution 72</w:t>
-      </w:r>
-    </w:p>
-    <w:p>
-      <w:pPr>
-        <w:spacing w:line="360" w:lineRule="auto"/>
-        <w:rPr>
-          <w:rFonts w:ascii="Calibri" w:hAnsi="Calibri" w:cs="Calibri"/>
-          <w:b/>
-          <w:bCs/>
-        </w:rPr>
-      </w:pPr>
-      <w:r>
-        <w:rPr>
-          <w:rFonts w:ascii="Calibri" w:hAnsi="Calibri" w:cs="Calibri"/>
-        </w:rPr>
-        <w:t xml:space="preserve">For </w:t>
-      </w:r>
-      <w:r>
-        <w:rPr>
-          <w:rFonts w:ascii="Calibri" w:hAnsi="Calibri" w:cs="Calibri"/>
-          <w:b/>
-          <w:bCs/>
-        </w:rPr>
-        <w:t xml:space="preserve">Vector </w:t>
-      </w:r>
-      <w:r>
-        <w:rPr>
-          <w:rFonts w:ascii="Calibri" w:hAnsi="Calibri" w:cs="Calibri"/>
-        </w:rPr>
-        <w:t xml:space="preserve">image projects use </w:t>
-      </w:r>
-      <w:r>
-        <w:rPr>
-          <w:rFonts w:ascii="Calibri" w:hAnsi="Calibri" w:cs="Calibri"/>
-          <w:b/>
-          <w:bCs/>
-        </w:rPr>
-        <w:t>Resolution 300</w:t>
-      </w:r>
-    </w:p>
-    <w:p>
-      <w:pPr>
-        <w:spacing w:line="360" w:lineRule="auto"/>
-        <w:rPr>
-          <w:rFonts w:ascii="Calibri" w:hAnsi="Calibri" w:cs="Calibri"/>
-          <w:b/>
-          <w:bCs/>
-        </w:rPr>
-      </w:pPr>
-      <w:r>
-        <w:rPr>
-          <w:rFonts w:ascii="Calibri" w:hAnsi="Calibri" w:cs="Calibri"/>
-        </w:rPr>
-        <w:t>Use</w:t>
-      </w:r>
-      <w:r>
-        <w:rPr>
-          <w:rFonts w:ascii="Calibri" w:hAnsi="Calibri" w:cs="Calibri"/>
-          <w:b/>
-          <w:bCs/>
-        </w:rPr>
-        <w:t xml:space="preserve"> Color mode →</w:t>
-      </w:r>
-      <w:r>
-        <w:rPr>
-          <w:rFonts w:ascii="Calibri" w:hAnsi="Calibri" w:cs="Calibri"/>
-          <w:b/>
-          <w:bCs/>
-          <w:lang w:val="uk-UA"/>
-        </w:rPr>
-        <w:t xml:space="preserve"> </w:t>
-      </w:r>
-      <w:r>
-        <w:rPr>
-          <w:rFonts w:ascii="Calibri" w:hAnsi="Calibri" w:cs="Calibri"/>
-          <w:b/>
-          <w:bCs/>
-        </w:rPr>
-        <w:t>RGB Color</w:t>
-      </w:r>
-    </w:p>
-    <w:p>
-      <w:pPr>
-        <w:rPr>
-          <w:rFonts w:ascii="Calibri" w:hAnsi="Calibri" w:cs="Calibri"/>
+          <w:b/>
+          <w:bCs/>
         </w:rPr>
       </w:pPr>
       <w:r>
@@ -2012,49 +2041,69 @@
           <w:b/>
           <w:bCs/>
         </w:rPr>
-        <w:t xml:space="preserve">import </w:t>
-      </w:r>
-      <w:r>
-        <w:rPr>
-          <w:rFonts w:ascii="Calibri" w:hAnsi="Calibri" w:cs="Calibri"/>
-        </w:rPr>
-        <w:t xml:space="preserve">resources in </w:t>
-      </w:r>
-      <w:r>
-        <w:rPr>
-          <w:rFonts w:ascii="Calibri" w:hAnsi="Calibri" w:cs="Calibri"/>
-        </w:rPr>
-        <w:t>a new</w:t>
-      </w:r>
-      <w:r>
-        <w:rPr>
-          <w:rFonts w:ascii="Calibri" w:hAnsi="Calibri" w:cs="Calibri"/>
-        </w:rPr>
-        <w:t xml:space="preserve"> document you can paste them </w:t>
-      </w:r>
-      <w:r>
-        <w:rPr>
-          <w:rFonts w:ascii="Calibri" w:hAnsi="Calibri" w:cs="Calibri"/>
-        </w:rPr>
-        <w:t>directly in Viewport or drag them from your folder.</w:t>
-      </w:r>
-    </w:p>
-    <w:p>
-      <w:pPr>
-        <w:jc w:val="center"/>
-        <w:rPr>
-          <w:rFonts w:ascii="Calibri" w:hAnsi="Calibri" w:cs="Calibri"/>
-        </w:rPr>
-      </w:pPr>
+        <w:t>import</w:t>
+      </w:r>
+      <w:r>
+        <w:rPr>
+          <w:rFonts w:ascii="Calibri" w:hAnsi="Calibri" w:cs="Calibri"/>
+        </w:rPr>
+        <w:t xml:space="preserve"> resources into a new document, you can either </w:t>
+      </w:r>
+      <w:r>
+        <w:rPr>
+          <w:rFonts w:ascii="Calibri" w:hAnsi="Calibri" w:cs="Calibri"/>
+          <w:b/>
+          <w:bCs/>
+        </w:rPr>
+        <w:t>paste them directly into the viewport</w:t>
+      </w:r>
+      <w:r>
+        <w:rPr>
+          <w:rFonts w:ascii="Calibri" w:hAnsi="Calibri" w:cs="Calibri"/>
+        </w:rPr>
+        <w:t xml:space="preserve"> or </w:t>
+      </w:r>
+      <w:r>
+        <w:rPr>
+          <w:rFonts w:ascii="Calibri" w:hAnsi="Calibri" w:cs="Calibri"/>
+          <w:b/>
+          <w:bCs/>
+        </w:rPr>
+        <w:t xml:space="preserve">drag and drop them from your </w:t>
+      </w:r>
+      <w:r>
+        <w:rPr>
+          <w:rFonts w:ascii="Calibri" w:hAnsi="Calibri" w:cs="Calibri"/>
+          <w:b/>
+          <w:bCs/>
+        </w:rPr>
+        <w:t>folder</w:t>
+      </w:r>
+      <w:r>
+        <w:rPr>
+          <w:rFonts w:ascii="Calibri" w:hAnsi="Calibri" w:cs="Calibri"/>
+          <w:b/>
+          <w:bCs/>
+        </w:rPr>
+        <w:t>:</w:t>
+      </w:r>
+      <w:r>
+        <w:rPr>
+          <w:rFonts w:ascii="Calibri" w:hAnsi="Calibri" w:cs="Calibri"/>
+          <w:b/>
+          <w:bCs/>
+        </w:rPr>
+        <w:t xml:space="preserve">       </w:t>
+      </w:r>
       <w:r>
         <w:rPr>
           <w:rFonts w:ascii="Calibri" w:hAnsi="Calibri" w:cs="Calibri"/>
           <w:noProof/>
         </w:rPr>
         <w:drawing>
-          <wp:inline distT="0" distB="0" distL="0" distR="0" wp14:anchorId="7E89546F" wp14:editId="3B1D85BA">
-            <wp:extent cx="3802380" cy="1439560"/>
-            <wp:effectExtent l="0" t="0" r="7620" b="8255"/>
+          <wp:inline distT="0" distB="0" distL="0" distR="0" wp14:anchorId="7E89546F" wp14:editId="74693FE3">
+            <wp:extent cx="3224530" cy="1220470"/>
+            <wp:effectExtent l="0" t="0" r="0" b="0"/>
             <wp:docPr id="1440661706" name="Picture 1" descr="A screenshot of a computer&#10;&#10;AI-generated content may be incorrect."/>
             <wp:cNvGraphicFramePr>
               <a:graphicFrameLocks xmlns:a="http://schemas.openxmlformats.org/drawingml/2006/main" noChangeAspect="1"/>
@@ -2067,7 +2116,13 @@
                     <pic:cNvPicPr/>
                   </pic:nvPicPr>
                   <pic:blipFill>
-                    <a:blip r:embed="rId7"/>
+                    <a:blip r:embed="rId7">
+                      <a:extLst>
+                        <a:ext uri="{28A0092B-C50C-407E-A947-70E740481C1C}">
+                          <a14:useLocalDpi xmlns:a14="http://schemas.microsoft.com/office/drawing/2010/main" val="0"/>
+                        </a:ext>
+                      </a:extLst>
+                    </a:blip>
                     <a:stretch>
                       <a:fillRect/>
                     </a:stretch>
@@ -2075,7 +2130,7 @@
                   <pic:spPr>
                     <a:xfrm>
                       <a:off x="0" y="0"/>
-                      <a:ext cx="3815640" cy="1444580"/>
+                      <a:ext cx="3224530" cy="1220470"/>
                     </a:xfrm>
                     <a:prstGeom prst="rect">
                       <a:avLst/>
@@ -2110,17 +2165,29 @@
         <w:spacing w:line="360" w:lineRule="auto"/>
         <w:rPr>
           <w:rFonts w:ascii="Calibri" w:hAnsi="Calibri" w:cs="Calibri"/>
-        </w:rPr>
-      </w:pPr>
-      <w:r>
-        <w:rPr>
-          <w:rFonts w:ascii="Calibri" w:hAnsi="Calibri" w:cs="Calibri"/>
+          <w:b/>
+          <w:bCs/>
+          <w:sz w:val="28"/>
+          <w:szCs w:val="28"/>
+        </w:rPr>
+      </w:pPr>
+      <w:r>
+        <w:rPr>
+          <w:rFonts w:ascii="Calibri" w:hAnsi="Calibri" w:cs="Calibri"/>
+          <w:b/>
+          <w:bCs/>
+          <w:sz w:val="28"/>
+          <w:szCs w:val="28"/>
         </w:rPr>
         <w:t>PSD File Requirements</w:t>
       </w:r>
       <w:r>
         <w:rPr>
           <w:rFonts w:ascii="Calibri" w:hAnsi="Calibri" w:cs="Calibri"/>
+          <w:b/>
+          <w:bCs/>
+          <w:sz w:val="28"/>
+          <w:szCs w:val="28"/>
           <w:lang w:val="uk-UA"/>
         </w:rPr>
         <w:t>:</w:t>
@@ -2158,21 +2225,80 @@
         <w:rPr>
           <w:rFonts w:ascii="Calibri" w:hAnsi="Calibri" w:cs="Calibri"/>
         </w:rPr>
-        <w:t xml:space="preserve">, using logic </w:t>
-      </w:r>
-      <w:r>
-        <w:rPr>
-          <w:rFonts w:ascii="Calibri" w:hAnsi="Calibri" w:cs="Calibri"/>
-        </w:rPr>
-        <w:t>like</w:t>
-      </w:r>
-      <w:r>
-        <w:rPr>
-          <w:rFonts w:ascii="Calibri" w:hAnsi="Calibri" w:cs="Calibri"/>
+        <w:t xml:space="preserve">, </w:t>
+      </w:r>
+      <w:r>
+        <w:rPr>
+          <w:rFonts w:ascii="Calibri" w:hAnsi="Calibri" w:cs="Calibri"/>
+        </w:rPr>
+        <w:t xml:space="preserve">following a logical pattern such as </w:t>
+      </w:r>
+      <w:r>
+        <w:rPr>
+          <w:rFonts w:ascii="Calibri" w:hAnsi="Calibri" w:cs="Calibri"/>
+          <w:i/>
+          <w:iCs/>
+        </w:rPr>
+        <w:t>body_head, fx_glow, ui_button_idle,</w:t>
+      </w:r>
+      <w:r>
+        <w:rPr>
+          <w:rFonts w:ascii="Calibri" w:hAnsi="Calibri" w:cs="Calibri"/>
+        </w:rPr>
+        <w:t xml:space="preserve"> etc.</w:t>
+      </w:r>
+    </w:p>
+    <w:p>
+      <w:pPr>
+        <w:pStyle w:val="NormalWeb"/>
+        <w:spacing w:line="360" w:lineRule="auto"/>
+        <w:rPr>
+          <w:rFonts w:ascii="Calibri" w:hAnsi="Calibri" w:cs="Calibri"/>
+        </w:rPr>
+      </w:pPr>
+      <w:r>
+        <w:rPr>
+          <w:rFonts w:ascii="Segoe UI Emoji" w:hAnsi="Segoe UI Emoji" w:cs="Segoe UI Emoji"/>
+        </w:rPr>
+        <w:t>✅</w:t>
+      </w:r>
+      <w:r>
+        <w:rPr>
+          <w:rFonts w:ascii="Calibri" w:hAnsi="Calibri" w:cs="Calibri"/>
+        </w:rPr>
+        <w:t xml:space="preserve"> Use </w:t>
+      </w:r>
+      <w:r>
+        <w:rPr>
+          <w:rStyle w:val="Strong"/>
+          <w:rFonts w:ascii="Calibri" w:eastAsiaTheme="majorEastAsia" w:hAnsi="Calibri" w:cs="Calibri"/>
+          <w:color w:val="4EA72E" w:themeColor="accent6"/>
+        </w:rPr>
+        <w:t xml:space="preserve">layer groups </w:t>
+      </w:r>
+      <w:r>
+        <w:rPr>
+          <w:rStyle w:val="Strong"/>
+          <w:rFonts w:ascii="Calibri" w:eastAsiaTheme="majorEastAsia" w:hAnsi="Calibri" w:cs="Calibri"/>
+          <w:b w:val="0"/>
+          <w:bCs w:val="0"/>
+          <w:color w:val="000000" w:themeColor="text1"/>
+        </w:rPr>
+        <w:t>(folders)</w:t>
+      </w:r>
+      <w:r>
+        <w:rPr>
+          <w:rFonts w:ascii="Calibri" w:hAnsi="Calibri" w:cs="Calibri"/>
+          <w:color w:val="000000" w:themeColor="text1"/>
         </w:rPr>
         <w:t xml:space="preserve"> </w:t>
       </w:r>
-      <w:proofErr w:type="spellStart"/>
+      <w:r>
+        <w:rPr>
+          <w:rFonts w:ascii="Calibri" w:hAnsi="Calibri" w:cs="Calibri"/>
+        </w:rPr>
+        <w:t xml:space="preserve">to separate logical sections: </w:t>
+      </w:r>
       <w:r>
         <w:rPr>
           <w:rStyle w:val="HTMLCode"/>
@@ -2182,9 +2308,8 @@
           <w:sz w:val="24"/>
           <w:szCs w:val="24"/>
         </w:rPr>
-        <w:t>body_head</w:t>
-      </w:r>
-      <w:proofErr w:type="spellEnd"/>
+        <w:t>Body</w:t>
+      </w:r>
       <w:r>
         <w:rPr>
           <w:rFonts w:ascii="Calibri" w:hAnsi="Calibri" w:cs="Calibri"/>
@@ -2193,7 +2318,6 @@
         </w:rPr>
         <w:t xml:space="preserve">, </w:t>
       </w:r>
-      <w:proofErr w:type="spellStart"/>
       <w:r>
         <w:rPr>
           <w:rStyle w:val="HTMLCode"/>
@@ -2203,9 +2327,8 @@
           <w:sz w:val="24"/>
           <w:szCs w:val="24"/>
         </w:rPr>
-        <w:t>fx_glow</w:t>
-      </w:r>
-      <w:proofErr w:type="spellEnd"/>
+        <w:t>FX</w:t>
+      </w:r>
       <w:r>
         <w:rPr>
           <w:rFonts w:ascii="Calibri" w:hAnsi="Calibri" w:cs="Calibri"/>
@@ -2214,7 +2337,6 @@
         </w:rPr>
         <w:t xml:space="preserve">, </w:t>
       </w:r>
-      <w:proofErr w:type="spellStart"/>
       <w:r>
         <w:rPr>
           <w:rStyle w:val="HTMLCode"/>
@@ -2224,152 +2346,58 @@
           <w:sz w:val="24"/>
           <w:szCs w:val="24"/>
         </w:rPr>
-        <w:t>ui_button_idle</w:t>
-      </w:r>
-      <w:proofErr w:type="spellEnd"/>
+        <w:t>UI</w:t>
+      </w:r>
+      <w:r>
+        <w:rPr>
+          <w:rFonts w:ascii="Calibri" w:hAnsi="Calibri" w:cs="Calibri"/>
+        </w:rPr>
+        <w:t>, etc.</w:t>
+      </w:r>
+    </w:p>
+    <w:p>
+      <w:pPr>
+        <w:pStyle w:val="NormalWeb"/>
+        <w:spacing w:line="360" w:lineRule="auto"/>
+        <w:rPr>
+          <w:rFonts w:ascii="Calibri" w:hAnsi="Calibri" w:cs="Calibri"/>
+        </w:rPr>
+      </w:pPr>
+      <w:r>
+        <w:rPr>
+          <w:rFonts w:ascii="Segoe UI Emoji" w:hAnsi="Segoe UI Emoji" w:cs="Segoe UI Emoji"/>
+        </w:rPr>
+        <w:t>✅</w:t>
+      </w:r>
+      <w:r>
+        <w:rPr>
+          <w:rFonts w:ascii="Calibri" w:hAnsi="Calibri" w:cs="Calibri"/>
+        </w:rPr>
+        <w:t xml:space="preserve"> </w:t>
+      </w:r>
+      <w:r>
+        <w:rPr>
+          <w:rFonts w:ascii="Calibri" w:hAnsi="Calibri" w:cs="Calibri"/>
+          <w:b/>
+          <w:bCs/>
+          <w:color w:val="4EA72E" w:themeColor="accent6"/>
+        </w:rPr>
+        <w:t>Avoid</w:t>
+      </w:r>
+      <w:r>
+        <w:rPr>
+          <w:rFonts w:ascii="Calibri" w:hAnsi="Calibri" w:cs="Calibri"/>
+        </w:rPr>
+        <w:t xml:space="preserve"> empty layers or layers with default names like </w:t>
+      </w:r>
       <w:r>
         <w:rPr>
           <w:rStyle w:val="HTMLCode"/>
           <w:rFonts w:ascii="Calibri" w:eastAsiaTheme="majorEastAsia" w:hAnsi="Calibri" w:cs="Calibri"/>
+          <w:b/>
+          <w:bCs/>
           <w:i/>
           <w:iCs/>
-          <w:sz w:val="24"/>
-          <w:szCs w:val="24"/>
-          <w:lang w:val="uk-UA"/>
-        </w:rPr>
-        <w:t xml:space="preserve"> </w:t>
-      </w:r>
-      <w:r>
-        <w:rPr>
-          <w:rStyle w:val="HTMLCode"/>
-          <w:rFonts w:ascii="Calibri" w:eastAsiaTheme="majorEastAsia" w:hAnsi="Calibri" w:cs="Calibri"/>
-          <w:sz w:val="24"/>
-          <w:szCs w:val="24"/>
-        </w:rPr>
-        <w:t>and so on</w:t>
-      </w:r>
-    </w:p>
-    <w:p>
-      <w:pPr>
-        <w:pStyle w:val="NormalWeb"/>
-        <w:spacing w:line="360" w:lineRule="auto"/>
-        <w:rPr>
-          <w:rFonts w:ascii="Calibri" w:hAnsi="Calibri" w:cs="Calibri"/>
-        </w:rPr>
-      </w:pPr>
-      <w:r>
-        <w:rPr>
-          <w:rFonts w:ascii="Segoe UI Emoji" w:hAnsi="Segoe UI Emoji" w:cs="Segoe UI Emoji"/>
-        </w:rPr>
-        <w:t>✅</w:t>
-      </w:r>
-      <w:r>
-        <w:rPr>
-          <w:rFonts w:ascii="Calibri" w:hAnsi="Calibri" w:cs="Calibri"/>
-        </w:rPr>
-        <w:t xml:space="preserve"> Use </w:t>
-      </w:r>
-      <w:r>
-        <w:rPr>
-          <w:rStyle w:val="Strong"/>
-          <w:rFonts w:ascii="Calibri" w:eastAsiaTheme="majorEastAsia" w:hAnsi="Calibri" w:cs="Calibri"/>
-          <w:color w:val="4EA72E" w:themeColor="accent6"/>
-        </w:rPr>
-        <w:t>folders</w:t>
-      </w:r>
-      <w:r>
-        <w:rPr>
-          <w:rFonts w:ascii="Calibri" w:hAnsi="Calibri" w:cs="Calibri"/>
-        </w:rPr>
-        <w:t xml:space="preserve"> (layer groups) to separate logical sections: </w:t>
-      </w:r>
-      <w:r>
-        <w:rPr>
-          <w:rStyle w:val="HTMLCode"/>
-          <w:rFonts w:ascii="Calibri" w:eastAsiaTheme="majorEastAsia" w:hAnsi="Calibri" w:cs="Calibri"/>
-          <w:sz w:val="24"/>
-          <w:szCs w:val="24"/>
-        </w:rPr>
-        <w:t>Body</w:t>
-      </w:r>
-      <w:r>
-        <w:rPr>
-          <w:rFonts w:ascii="Calibri" w:hAnsi="Calibri" w:cs="Calibri"/>
-        </w:rPr>
-        <w:t xml:space="preserve">, </w:t>
-      </w:r>
-      <w:r>
-        <w:rPr>
-          <w:rStyle w:val="HTMLCode"/>
-          <w:rFonts w:ascii="Calibri" w:eastAsiaTheme="majorEastAsia" w:hAnsi="Calibri" w:cs="Calibri"/>
-          <w:sz w:val="24"/>
-          <w:szCs w:val="24"/>
-        </w:rPr>
-        <w:t>FX</w:t>
-      </w:r>
-      <w:r>
-        <w:rPr>
-          <w:rFonts w:ascii="Calibri" w:hAnsi="Calibri" w:cs="Calibri"/>
-        </w:rPr>
-        <w:t xml:space="preserve">, </w:t>
-      </w:r>
-      <w:r>
-        <w:rPr>
-          <w:rStyle w:val="HTMLCode"/>
-          <w:rFonts w:ascii="Calibri" w:eastAsiaTheme="majorEastAsia" w:hAnsi="Calibri" w:cs="Calibri"/>
-          <w:sz w:val="24"/>
-          <w:szCs w:val="24"/>
-        </w:rPr>
-        <w:t>UI</w:t>
-      </w:r>
-      <w:r>
-        <w:rPr>
-          <w:rFonts w:ascii="Calibri" w:hAnsi="Calibri" w:cs="Calibri"/>
-        </w:rPr>
-        <w:t>, etc.</w:t>
-      </w:r>
-    </w:p>
-    <w:p>
-      <w:pPr>
-        <w:pStyle w:val="NormalWeb"/>
-        <w:spacing w:line="360" w:lineRule="auto"/>
-        <w:rPr>
-          <w:rFonts w:ascii="Calibri" w:hAnsi="Calibri" w:cs="Calibri"/>
-        </w:rPr>
-      </w:pPr>
-      <w:r>
-        <w:rPr>
-          <w:rFonts w:ascii="Segoe UI Emoji" w:hAnsi="Segoe UI Emoji" w:cs="Segoe UI Emoji"/>
-        </w:rPr>
-        <w:t>✅</w:t>
-      </w:r>
-      <w:r>
-        <w:rPr>
-          <w:rFonts w:ascii="Calibri" w:hAnsi="Calibri" w:cs="Calibri"/>
-        </w:rPr>
-        <w:t xml:space="preserve"> </w:t>
-      </w:r>
-      <w:r>
-        <w:rPr>
-          <w:rFonts w:ascii="Calibri" w:hAnsi="Calibri" w:cs="Calibri"/>
-          <w:b/>
-          <w:bCs/>
-          <w:color w:val="4EA72E" w:themeColor="accent6"/>
-        </w:rPr>
-        <w:t>Avoid</w:t>
-      </w:r>
-      <w:r>
-        <w:rPr>
-          <w:rFonts w:ascii="Calibri" w:hAnsi="Calibri" w:cs="Calibri"/>
-        </w:rPr>
-        <w:t xml:space="preserve"> empty layers or layers with default names like </w:t>
-      </w:r>
-      <w:r>
-        <w:rPr>
-          <w:rStyle w:val="HTMLCode"/>
-          <w:rFonts w:ascii="Calibri" w:eastAsiaTheme="majorEastAsia" w:hAnsi="Calibri" w:cs="Calibri"/>
-          <w:b/>
-          <w:bCs/>
           <w:color w:val="FF0000"/>
           <w:sz w:val="24"/>
           <w:szCs w:val="24"/>
@@ -2379,8 +2407,24 @@
       <w:r>
         <w:rPr>
           <w:rFonts w:ascii="Calibri" w:hAnsi="Calibri" w:cs="Calibri"/>
-        </w:rPr>
-        <w:t xml:space="preserve"> or </w:t>
+          <w:i/>
+          <w:iCs/>
+        </w:rPr>
+        <w:t xml:space="preserve"> </w:t>
+      </w:r>
+      <w:r>
+        <w:rPr>
+          <w:rFonts w:ascii="Calibri" w:hAnsi="Calibri" w:cs="Calibri"/>
+        </w:rPr>
+        <w:t>or</w:t>
+      </w:r>
+      <w:r>
+        <w:rPr>
+          <w:rFonts w:ascii="Calibri" w:hAnsi="Calibri" w:cs="Calibri"/>
+          <w:i/>
+          <w:iCs/>
+        </w:rPr>
+        <w:t xml:space="preserve"> </w:t>
       </w:r>
       <w:r>
         <w:rPr>
@@ -2388,6 +2432,8 @@
           <w:rFonts w:ascii="Calibri" w:eastAsiaTheme="majorEastAsia" w:hAnsi="Calibri" w:cs="Calibri"/>
           <w:b/>
           <w:bCs/>
+          <w:i/>
+          <w:iCs/>
           <w:color w:val="FF0000"/>
           <w:sz w:val="24"/>
           <w:szCs w:val="24"/>
@@ -2436,7 +2482,6 @@
         </w:rPr>
         <w:t xml:space="preserve">. (for example, </w:t>
       </w:r>
-      <w:proofErr w:type="spellStart"/>
       <w:r>
         <w:rPr>
           <w:rFonts w:ascii="Calibri" w:hAnsi="Calibri" w:cs="Calibri"/>
@@ -2445,14 +2490,12 @@
         </w:rPr>
         <w:t>RightLeg</w:t>
       </w:r>
-      <w:proofErr w:type="spellEnd"/>
       <w:r>
         <w:rPr>
           <w:rFonts w:ascii="Calibri" w:hAnsi="Calibri" w:cs="Calibri"/>
         </w:rPr>
         <w:t xml:space="preserve">, </w:t>
       </w:r>
-      <w:proofErr w:type="spellStart"/>
       <w:r>
         <w:rPr>
           <w:rFonts w:ascii="Calibri" w:hAnsi="Calibri" w:cs="Calibri"/>
@@ -2461,7 +2504,6 @@
         </w:rPr>
         <w:t>LeftThigh</w:t>
       </w:r>
-      <w:proofErr w:type="spellEnd"/>
       <w:r>
         <w:rPr>
           <w:rFonts w:ascii="Calibri" w:hAnsi="Calibri" w:cs="Calibri"/>
@@ -2748,15 +2790,26 @@
           <w:kern w:val="0"/>
           <w14:ligatures w14:val="none"/>
         </w:rPr>
-        <w:t>“slice”</w:t>
-      </w:r>
-      <w:r>
-        <w:rPr>
-          <w:rFonts w:ascii="Calibri" w:eastAsia="Times New Roman" w:hAnsi="Calibri" w:cs="Calibri"/>
+        <w:t>“slice</w:t>
+      </w:r>
+      <w:r>
+        <w:rPr>
+          <w:rFonts w:ascii="Calibri" w:eastAsia="Times New Roman" w:hAnsi="Calibri" w:cs="Calibri"/>
+          <w:b/>
+          <w:bCs/>
           <w:color w:val="4EA72E" w:themeColor="accent6"/>
           <w:kern w:val="0"/>
           <w14:ligatures w14:val="none"/>
         </w:rPr>
+        <w:t>”</w:t>
+      </w:r>
+      <w:r>
+        <w:rPr>
+          <w:rFonts w:ascii="Calibri" w:eastAsia="Times New Roman" w:hAnsi="Calibri" w:cs="Calibri"/>
+          <w:color w:val="4EA72E" w:themeColor="accent6"/>
+          <w:kern w:val="0"/>
+          <w14:ligatures w14:val="none"/>
+        </w:rPr>
         <w:t xml:space="preserve"> </w:t>
       </w:r>
       <w:r>
@@ -2765,7 +2818,41 @@
           <w:kern w:val="0"/>
           <w14:ligatures w14:val="none"/>
         </w:rPr>
-        <w:t>them logically. It will be easier to work with art. (for example, to animate ALL symbols from this label separately)</w:t>
+        <w:t xml:space="preserve">them logically. It will be easier to work with art. (for example, to animate ALL </w:t>
+      </w:r>
+      <w:proofErr w:type="gramStart"/>
+      <w:r>
+        <w:rPr>
+          <w:rFonts w:ascii="Calibri" w:eastAsia="Times New Roman" w:hAnsi="Calibri" w:cs="Calibri"/>
+          <w:kern w:val="0"/>
+          <w14:ligatures w14:val="none"/>
+        </w:rPr>
+        <w:t>symbols</w:t>
+      </w:r>
+      <w:proofErr w:type="gramEnd"/>
+      <w:r>
+        <w:rPr>
+          <w:rFonts w:ascii="Calibri" w:eastAsia="Times New Roman" w:hAnsi="Calibri" w:cs="Calibri"/>
+          <w:kern w:val="0"/>
+          <w14:ligatures w14:val="none"/>
+        </w:rPr>
+        <w:t xml:space="preserve"> from this label </w:t>
+      </w:r>
+      <w:r>
+        <w:rPr>
+          <w:rFonts w:ascii="Calibri" w:eastAsia="Times New Roman" w:hAnsi="Calibri" w:cs="Calibri"/>
+          <w:kern w:val="0"/>
+          <w14:ligatures w14:val="none"/>
+        </w:rPr>
+        <w:t xml:space="preserve">below </w:t>
+      </w:r>
+      <w:r>
+        <w:rPr>
+          <w:rFonts w:ascii="Calibri" w:eastAsia="Times New Roman" w:hAnsi="Calibri" w:cs="Calibri"/>
+          <w:kern w:val="0"/>
+          <w14:ligatures w14:val="none"/>
+        </w:rPr>
+        <w:t>separately)</w:t>
       </w:r>
     </w:p>
     <w:p>
@@ -2876,7 +2963,47 @@
           <w:kern w:val="0"/>
           <w14:ligatures w14:val="none"/>
         </w:rPr>
-        <w:t xml:space="preserve"> (idle, running and so on)</w:t>
+        <w:t xml:space="preserve"> (</w:t>
+      </w:r>
+      <w:r>
+        <w:rPr>
+          <w:rFonts w:ascii="Calibri" w:eastAsia="Times New Roman" w:hAnsi="Calibri" w:cs="Calibri"/>
+          <w:b/>
+          <w:bCs/>
+          <w:kern w:val="0"/>
+          <w14:ligatures w14:val="none"/>
+        </w:rPr>
+        <w:t xml:space="preserve">e.g., </w:t>
+      </w:r>
+      <w:r>
+        <w:rPr>
+          <w:rFonts w:ascii="Calibri" w:eastAsia="Times New Roman" w:hAnsi="Calibri" w:cs="Calibri"/>
+          <w:b/>
+          <w:bCs/>
+          <w:kern w:val="0"/>
+          <w14:ligatures w14:val="none"/>
+        </w:rPr>
+        <w:t xml:space="preserve">idle, running </w:t>
+      </w:r>
+      <w:r>
+        <w:rPr>
+          <w:rFonts w:ascii="Calibri" w:eastAsia="Times New Roman" w:hAnsi="Calibri" w:cs="Calibri"/>
+          <w:b/>
+          <w:bCs/>
+          <w:kern w:val="0"/>
+          <w14:ligatures w14:val="none"/>
+        </w:rPr>
+        <w:t>etc.</w:t>
+      </w:r>
+      <w:r>
+        <w:rPr>
+          <w:rFonts w:ascii="Calibri" w:eastAsia="Times New Roman" w:hAnsi="Calibri" w:cs="Calibri"/>
+          <w:b/>
+          <w:bCs/>
+          <w:kern w:val="0"/>
+          <w14:ligatures w14:val="none"/>
+        </w:rPr>
+        <w:t>)</w:t>
       </w:r>
       <w:r>
         <w:rPr>
@@ -2905,39 +3032,88 @@
           <w:kern w:val="0"/>
           <w14:ligatures w14:val="none"/>
         </w:rPr>
-        <w:t xml:space="preserve"> body parts into different layers. If these parts will bend, you can adjust </w:t>
-      </w:r>
-      <w:r>
-        <w:rPr>
-          <w:rFonts w:ascii="Calibri" w:eastAsia="Times New Roman" w:hAnsi="Calibri" w:cs="Calibri"/>
-          <w:kern w:val="0"/>
-          <w14:ligatures w14:val="none"/>
-        </w:rPr>
-        <w:t>the layer</w:t>
-      </w:r>
-      <w:r>
-        <w:rPr>
-          <w:rFonts w:ascii="Calibri" w:eastAsia="Times New Roman" w:hAnsi="Calibri" w:cs="Calibri"/>
-          <w:kern w:val="0"/>
-          <w14:ligatures w14:val="none"/>
-        </w:rPr>
-        <w:t xml:space="preserve"> by drawing extra space in </w:t>
-      </w:r>
-      <w:r>
-        <w:rPr>
-          <w:rFonts w:ascii="Calibri" w:eastAsia="Times New Roman" w:hAnsi="Calibri" w:cs="Calibri"/>
-          <w:kern w:val="0"/>
-          <w14:ligatures w14:val="none"/>
-        </w:rPr>
-        <w:t>the place</w:t>
-      </w:r>
-      <w:r>
-        <w:rPr>
-          <w:rFonts w:ascii="Calibri" w:eastAsia="Times New Roman" w:hAnsi="Calibri" w:cs="Calibri"/>
-          <w:kern w:val="0"/>
-          <w14:ligatures w14:val="none"/>
-        </w:rPr>
-        <w:t xml:space="preserve"> that will bend.</w:t>
+        <w:t xml:space="preserve"> body parts into different layers. </w:t>
+      </w:r>
+      <w:r>
+        <w:rPr>
+          <w:rFonts w:ascii="Calibri" w:eastAsia="Times New Roman" w:hAnsi="Calibri" w:cs="Calibri"/>
+          <w:kern w:val="0"/>
+          <w14:ligatures w14:val="none"/>
+        </w:rPr>
+        <w:t xml:space="preserve">If any parts are expected to </w:t>
+      </w:r>
+      <w:r>
+        <w:rPr>
+          <w:rFonts w:ascii="Calibri" w:eastAsia="Times New Roman" w:hAnsi="Calibri" w:cs="Calibri"/>
+          <w:b/>
+          <w:bCs/>
+          <w:kern w:val="0"/>
+          <w14:ligatures w14:val="none"/>
+        </w:rPr>
+        <w:t>bend or rotate</w:t>
+      </w:r>
+      <w:r>
+        <w:rPr>
+          <w:rFonts w:ascii="Calibri" w:eastAsia="Times New Roman" w:hAnsi="Calibri" w:cs="Calibri"/>
+          <w:kern w:val="0"/>
+          <w14:ligatures w14:val="none"/>
+        </w:rPr>
+        <w:t xml:space="preserve">, make sure to </w:t>
+      </w:r>
+      <w:r>
+        <w:rPr>
+          <w:rFonts w:ascii="Calibri" w:eastAsia="Times New Roman" w:hAnsi="Calibri" w:cs="Calibri"/>
+          <w:b/>
+          <w:bCs/>
+          <w:color w:val="4EA72E" w:themeColor="accent6"/>
+          <w:kern w:val="0"/>
+          <w14:ligatures w14:val="none"/>
+        </w:rPr>
+        <w:t>extend the artwork</w:t>
+      </w:r>
+      <w:r>
+        <w:rPr>
+          <w:rFonts w:ascii="Calibri" w:eastAsia="Times New Roman" w:hAnsi="Calibri" w:cs="Calibri"/>
+          <w:b/>
+          <w:bCs/>
+          <w:color w:val="4EA72E" w:themeColor="accent6"/>
+          <w:kern w:val="0"/>
+          <w14:ligatures w14:val="none"/>
+        </w:rPr>
+        <w:t xml:space="preserve"> space</w:t>
+      </w:r>
+      <w:r>
+        <w:rPr>
+          <w:rFonts w:ascii="Calibri" w:eastAsia="Times New Roman" w:hAnsi="Calibri" w:cs="Calibri"/>
+          <w:color w:val="4EA72E" w:themeColor="accent6"/>
+          <w:kern w:val="0"/>
+          <w14:ligatures w14:val="none"/>
+        </w:rPr>
+        <w:t xml:space="preserve"> </w:t>
+      </w:r>
+      <w:r>
+        <w:rPr>
+          <w:rFonts w:ascii="Calibri" w:eastAsia="Times New Roman" w:hAnsi="Calibri" w:cs="Calibri"/>
+          <w:kern w:val="0"/>
+          <w14:ligatures w14:val="none"/>
+        </w:rPr>
+        <w:t xml:space="preserve">slightly in the bending areas. </w:t>
+      </w:r>
+      <w:r>
+        <w:rPr>
+          <w:rFonts w:ascii="Calibri" w:eastAsia="Times New Roman" w:hAnsi="Calibri" w:cs="Calibri"/>
+          <w:kern w:val="0"/>
+          <w14:ligatures w14:val="none"/>
+        </w:rPr>
+        <w:t>It</w:t>
+      </w:r>
+      <w:r>
+        <w:rPr>
+          <w:rFonts w:ascii="Calibri" w:eastAsia="Times New Roman" w:hAnsi="Calibri" w:cs="Calibri"/>
+          <w:kern w:val="0"/>
+          <w14:ligatures w14:val="none"/>
+        </w:rPr>
+        <w:t xml:space="preserve"> helps maintain visual continuity during transformations like rotation or deformation.</w:t>
       </w:r>
     </w:p>
     <w:p>
@@ -2965,7 +3141,7 @@
           <w14:ligatures w14:val="none"/>
         </w:rPr>
         <w:drawing>
-          <wp:anchor distT="0" distB="0" distL="114300" distR="114300" simplePos="0" relativeHeight="251662336" behindDoc="0" locked="0" layoutInCell="1" allowOverlap="1" wp14:anchorId="04E0D8D9" wp14:editId="01A5E437">
+          <wp:anchor distT="0" distB="0" distL="114300" distR="114300" simplePos="0" relativeHeight="251662336" behindDoc="0" locked="0" layoutInCell="1" allowOverlap="1" wp14:anchorId="04E0D8D9" wp14:editId="485924D6">
             <wp:simplePos x="0" y="0"/>
             <wp:positionH relativeFrom="column">
               <wp:posOffset>2301240</wp:posOffset>
@@ -3153,7 +3329,17 @@
           <w:kern w:val="0"/>
           <w14:ligatures w14:val="none"/>
         </w:rPr>
-        <w:t>← Extra space</w:t>
+        <w:t xml:space="preserve">← </w:t>
+      </w:r>
+      <w:r>
+        <w:rPr>
+          <w:rFonts w:ascii="Calibri" w:eastAsia="Times New Roman" w:hAnsi="Calibri" w:cs="Calibri"/>
+          <w:b/>
+          <w:bCs/>
+          <w:kern w:val="0"/>
+          <w14:ligatures w14:val="none"/>
+        </w:rPr>
+        <w:t>Where extra space is needed</w:t>
       </w:r>
     </w:p>
     <w:p>
@@ -3239,7 +3425,7 @@
           <w:noProof/>
         </w:rPr>
         <w:drawing>
-          <wp:anchor distT="0" distB="0" distL="114300" distR="114300" simplePos="0" relativeHeight="251660288" behindDoc="0" locked="0" layoutInCell="1" allowOverlap="1" wp14:anchorId="456CF235" wp14:editId="605395C7">
+          <wp:anchor distT="0" distB="0" distL="114300" distR="114300" simplePos="0" relativeHeight="251660288" behindDoc="0" locked="0" layoutInCell="1" allowOverlap="1" wp14:anchorId="456CF235" wp14:editId="27BAE7BE">
             <wp:simplePos x="0" y="0"/>
             <wp:positionH relativeFrom="column">
               <wp:posOffset>3718560</wp:posOffset>
@@ -3298,7 +3484,7 @@
           <w14:ligatures w14:val="none"/>
         </w:rPr>
         <w:drawing>
-          <wp:anchor distT="0" distB="0" distL="114300" distR="114300" simplePos="0" relativeHeight="251661312" behindDoc="0" locked="0" layoutInCell="1" allowOverlap="1" wp14:anchorId="652D222F" wp14:editId="223181F7">
+          <wp:anchor distT="0" distB="0" distL="114300" distR="114300" simplePos="0" relativeHeight="251661312" behindDoc="0" locked="0" layoutInCell="1" allowOverlap="1" wp14:anchorId="652D222F" wp14:editId="76940619">
             <wp:simplePos x="0" y="0"/>
             <wp:positionH relativeFrom="column">
               <wp:posOffset>739140</wp:posOffset>
@@ -3407,25 +3593,7 @@
           <w:kern w:val="0"/>
           <w14:ligatures w14:val="none"/>
         </w:rPr>
-        <w:t xml:space="preserve">To export your layers, you can use </w:t>
-      </w:r>
-      <w:proofErr w:type="spellStart"/>
-      <w:r>
-        <w:rPr>
-          <w:rFonts w:ascii="Calibri" w:eastAsia="Times New Roman" w:hAnsi="Calibri" w:cs="Calibri"/>
-          <w:kern w:val="0"/>
-          <w14:ligatures w14:val="none"/>
-        </w:rPr>
-        <w:t>PhotoshopToSpine</w:t>
-      </w:r>
-      <w:proofErr w:type="spellEnd"/>
-      <w:r>
-        <w:rPr>
-          <w:rFonts w:ascii="Calibri" w:eastAsia="Times New Roman" w:hAnsi="Calibri" w:cs="Calibri"/>
-          <w:kern w:val="0"/>
-          <w14:ligatures w14:val="none"/>
-        </w:rPr>
-        <w:t xml:space="preserve"> Script. It</w:t>
+        <w:t>To export your layers, you can use PhotoshopToSpine Script. It</w:t>
       </w:r>
       <w:r>
         <w:rPr>
@@ -3451,65 +3619,49 @@
         </w:rPr>
         <w:t xml:space="preserve"> useful to fast export </w:t>
       </w:r>
-      <w:proofErr w:type="gramStart"/>
-      <w:r>
-        <w:rPr>
-          <w:rFonts w:ascii="Calibri" w:eastAsia="Times New Roman" w:hAnsi="Calibri" w:cs="Calibri"/>
-          <w:kern w:val="0"/>
-          <w14:ligatures w14:val="none"/>
-        </w:rPr>
-        <w:t xml:space="preserve">into </w:t>
-      </w:r>
-      <w:r>
-        <w:rPr>
-          <w:rFonts w:ascii="Calibri" w:eastAsia="Times New Roman" w:hAnsi="Calibri" w:cs="Calibri"/>
-        </w:rPr>
-        <w:t>.</w:t>
-      </w:r>
-      <w:proofErr w:type="spellStart"/>
-      <w:r>
-        <w:rPr>
-          <w:rFonts w:ascii="Calibri" w:eastAsia="Times New Roman" w:hAnsi="Calibri" w:cs="Calibri"/>
-          <w:kern w:val="0"/>
-          <w14:ligatures w14:val="none"/>
-        </w:rPr>
-        <w:t>jso</w:t>
-      </w:r>
-      <w:r>
-        <w:rPr>
-          <w:rFonts w:ascii="Calibri" w:eastAsia="Times New Roman" w:hAnsi="Calibri" w:cs="Calibri"/>
-          <w:kern w:val="0"/>
-          <w14:ligatures w14:val="none"/>
-        </w:rPr>
-        <w:t>n</w:t>
-      </w:r>
-      <w:proofErr w:type="spellEnd"/>
-      <w:proofErr w:type="gramEnd"/>
-      <w:r>
-        <w:rPr>
-          <w:rFonts w:ascii="Calibri" w:eastAsia="Times New Roman" w:hAnsi="Calibri" w:cs="Calibri"/>
-          <w:kern w:val="0"/>
-          <w14:ligatures w14:val="none"/>
-        </w:rPr>
-        <w:t xml:space="preserve"> all your assets from </w:t>
-      </w:r>
-      <w:proofErr w:type="gramStart"/>
-      <w:r>
-        <w:rPr>
-          <w:rFonts w:ascii="Calibri" w:eastAsia="Times New Roman" w:hAnsi="Calibri" w:cs="Calibri"/>
-          <w:kern w:val="0"/>
-          <w14:ligatures w14:val="none"/>
-        </w:rPr>
-        <w:t>layer</w:t>
-      </w:r>
-      <w:proofErr w:type="gramEnd"/>
-      <w:r>
-        <w:rPr>
-          <w:rFonts w:ascii="Calibri" w:eastAsia="Times New Roman" w:hAnsi="Calibri" w:cs="Calibri"/>
-          <w:kern w:val="0"/>
-          <w14:ligatures w14:val="none"/>
-        </w:rPr>
-        <w:t>.</w:t>
+      <w:r>
+        <w:rPr>
+          <w:rFonts w:ascii="Calibri" w:eastAsia="Times New Roman" w:hAnsi="Calibri" w:cs="Calibri"/>
+          <w:kern w:val="0"/>
+          <w14:ligatures w14:val="none"/>
+        </w:rPr>
+        <w:t>into</w:t>
+      </w:r>
+      <w:r>
+        <w:rPr>
+          <w:rFonts w:ascii="Calibri" w:eastAsia="Times New Roman" w:hAnsi="Calibri" w:cs="Calibri"/>
+          <w:kern w:val="0"/>
+          <w14:ligatures w14:val="none"/>
+        </w:rPr>
+        <w:t xml:space="preserve"> </w:t>
+      </w:r>
+      <w:r>
+        <w:rPr>
+          <w:rFonts w:ascii="Calibri" w:eastAsia="Times New Roman" w:hAnsi="Calibri" w:cs="Calibri"/>
+          <w:i/>
+          <w:iCs/>
+          <w:kern w:val="0"/>
+          <w14:ligatures w14:val="none"/>
+        </w:rPr>
+        <w:t>.json</w:t>
+      </w:r>
+      <w:r>
+        <w:rPr>
+          <w:rFonts w:ascii="Calibri" w:eastAsia="Times New Roman" w:hAnsi="Calibri" w:cs="Calibri"/>
+          <w:i/>
+          <w:iCs/>
+          <w:kern w:val="0"/>
+          <w14:ligatures w14:val="none"/>
+        </w:rPr>
+        <w:t xml:space="preserve"> </w:t>
+      </w:r>
+      <w:r>
+        <w:rPr>
+          <w:rFonts w:ascii="Calibri" w:eastAsia="Times New Roman" w:hAnsi="Calibri" w:cs="Calibri"/>
+          <w:kern w:val="0"/>
+          <w14:ligatures w14:val="none"/>
+        </w:rPr>
+        <w:t>all your assets from layer.</w:t>
       </w:r>
       <w:r>
         <w:rPr>
@@ -3527,27 +3679,7 @@
             <w:kern w:val="0"/>
             <w14:ligatures w14:val="none"/>
           </w:rPr>
-          <w:t xml:space="preserve">Official </w:t>
-        </w:r>
-        <w:proofErr w:type="spellStart"/>
-        <w:r>
-          <w:rPr>
-            <w:rStyle w:val="Hyperlink"/>
-            <w:rFonts w:ascii="Calibri" w:eastAsia="Times New Roman" w:hAnsi="Calibri" w:cs="Calibri"/>
-            <w:kern w:val="0"/>
-            <w14:ligatures w14:val="none"/>
-          </w:rPr>
-          <w:t>EsotericSoftware</w:t>
-        </w:r>
-        <w:proofErr w:type="spellEnd"/>
-        <w:r>
-          <w:rPr>
-            <w:rStyle w:val="Hyperlink"/>
-            <w:rFonts w:ascii="Calibri" w:eastAsia="Times New Roman" w:hAnsi="Calibri" w:cs="Calibri"/>
-            <w:kern w:val="0"/>
-            <w14:ligatures w14:val="none"/>
-          </w:rPr>
-          <w:t xml:space="preserve"> GitHub</w:t>
+          <w:t>Official EsotericSoftware GitHub</w:t>
         </w:r>
       </w:hyperlink>
       <w:r>
@@ -3561,50 +3693,38 @@
     </w:p>
     <w:p>
       <w:pPr>
+        <w:numPr>
+          <w:ilvl w:val="0"/>
+          <w:numId w:val="8"/>
+        </w:numPr>
         <w:spacing w:line="360" w:lineRule="auto"/>
         <w:rPr>
           <w:rFonts w:ascii="Calibri" w:eastAsia="Times New Roman" w:hAnsi="Calibri" w:cs="Calibri"/>
-          <w:b/>
-          <w:bCs/>
-          <w:kern w:val="0"/>
-          <w14:ligatures w14:val="none"/>
-        </w:rPr>
-      </w:pPr>
-      <w:r>
-        <w:rPr>
-          <w:rFonts w:ascii="Calibri" w:eastAsia="Times New Roman" w:hAnsi="Calibri" w:cs="Calibri"/>
-          <w:kern w:val="0"/>
-          <w14:ligatures w14:val="none"/>
-        </w:rPr>
-        <w:t>Go</w:t>
-      </w:r>
-      <w:r>
-        <w:rPr>
-          <w:rFonts w:ascii="Calibri" w:eastAsia="Times New Roman" w:hAnsi="Calibri" w:cs="Calibri"/>
-          <w:b/>
-          <w:bCs/>
-          <w:kern w:val="0"/>
-          <w14:ligatures w14:val="none"/>
-        </w:rPr>
-        <w:t xml:space="preserve"> File → Scripts → </w:t>
-      </w:r>
-      <w:proofErr w:type="spellStart"/>
-      <w:r>
-        <w:rPr>
-          <w:rFonts w:ascii="Calibri" w:eastAsia="Times New Roman" w:hAnsi="Calibri" w:cs="Calibri"/>
-          <w:b/>
-          <w:bCs/>
-          <w:kern w:val="0"/>
-          <w14:ligatures w14:val="none"/>
-        </w:rPr>
-        <w:t>PhotoshopToSpine</w:t>
-      </w:r>
-      <w:proofErr w:type="spellEnd"/>
-      <w:r>
-        <w:rPr>
-          <w:rFonts w:ascii="Calibri" w:eastAsia="Times New Roman" w:hAnsi="Calibri" w:cs="Calibri"/>
-          <w:b/>
-          <w:bCs/>
+          <w:kern w:val="0"/>
+          <w14:ligatures w14:val="none"/>
+        </w:rPr>
+      </w:pPr>
+      <w:r>
+        <w:rPr>
+          <w:rFonts w:ascii="Calibri" w:eastAsia="Times New Roman" w:hAnsi="Calibri" w:cs="Calibri"/>
+          <w:kern w:val="0"/>
+          <w14:ligatures w14:val="none"/>
+        </w:rPr>
+        <w:t xml:space="preserve">Go to </w:t>
+      </w:r>
+      <w:r>
+        <w:rPr>
+          <w:rFonts w:ascii="Calibri" w:eastAsia="Times New Roman" w:hAnsi="Calibri" w:cs="Calibri"/>
+          <w:b/>
+          <w:bCs/>
+          <w:kern w:val="0"/>
+          <w14:ligatures w14:val="none"/>
+        </w:rPr>
+        <w:t>File → Scripts → PhotoshopToSpine</w:t>
+      </w:r>
+      <w:r>
+        <w:rPr>
+          <w:rFonts w:ascii="Calibri" w:eastAsia="Times New Roman" w:hAnsi="Calibri" w:cs="Calibri"/>
           <w:kern w:val="0"/>
           <w14:ligatures w14:val="none"/>
         </w:rPr>
@@ -3613,6 +3733,10 @@
     </w:p>
     <w:p>
       <w:pPr>
+        <w:numPr>
+          <w:ilvl w:val="0"/>
+          <w:numId w:val="8"/>
+        </w:numPr>
         <w:spacing w:line="360" w:lineRule="auto"/>
         <w:rPr>
           <w:rFonts w:ascii="Calibri" w:eastAsia="Times New Roman" w:hAnsi="Calibri" w:cs="Calibri"/>
@@ -3626,41 +3750,30 @@
           <w:kern w:val="0"/>
           <w14:ligatures w14:val="none"/>
         </w:rPr>
-        <w:t xml:space="preserve">Choose </w:t>
-      </w:r>
-      <w:r>
-        <w:rPr>
-          <w:rFonts w:ascii="Calibri" w:eastAsia="Times New Roman" w:hAnsi="Calibri" w:cs="Calibri"/>
-          <w:kern w:val="0"/>
-          <w14:ligatures w14:val="none"/>
-        </w:rPr>
-        <w:t>a setting</w:t>
-      </w:r>
-      <w:r>
-        <w:rPr>
-          <w:rFonts w:ascii="Calibri" w:eastAsia="Times New Roman" w:hAnsi="Calibri" w:cs="Calibri"/>
-          <w:kern w:val="0"/>
-          <w14:ligatures w14:val="none"/>
-        </w:rPr>
-        <w:t xml:space="preserve"> that </w:t>
-      </w:r>
-      <w:r>
-        <w:rPr>
-          <w:rFonts w:ascii="Calibri" w:eastAsia="Times New Roman" w:hAnsi="Calibri" w:cs="Calibri"/>
-          <w:kern w:val="0"/>
-          <w14:ligatures w14:val="none"/>
-        </w:rPr>
-        <w:t>is suitable</w:t>
-      </w:r>
-      <w:r>
-        <w:rPr>
-          <w:rFonts w:ascii="Calibri" w:eastAsia="Times New Roman" w:hAnsi="Calibri" w:cs="Calibri"/>
-          <w:kern w:val="0"/>
-          <w14:ligatures w14:val="none"/>
-        </w:rPr>
-        <w:t xml:space="preserve"> for your project, make sure </w:t>
-      </w:r>
-      <w:proofErr w:type="gramStart"/>
+        <w:t>Choose the settings appropriate for your project.</w:t>
+      </w:r>
+    </w:p>
+    <w:p>
+      <w:pPr>
+        <w:numPr>
+          <w:ilvl w:val="0"/>
+          <w:numId w:val="8"/>
+        </w:numPr>
+        <w:spacing w:line="360" w:lineRule="auto"/>
+        <w:rPr>
+          <w:rFonts w:ascii="Calibri" w:eastAsia="Times New Roman" w:hAnsi="Calibri" w:cs="Calibri"/>
+          <w:kern w:val="0"/>
+          <w14:ligatures w14:val="none"/>
+        </w:rPr>
+      </w:pPr>
+      <w:r>
+        <w:rPr>
+          <w:rFonts w:ascii="Calibri" w:eastAsia="Times New Roman" w:hAnsi="Calibri" w:cs="Calibri"/>
+          <w:kern w:val="0"/>
+          <w14:ligatures w14:val="none"/>
+        </w:rPr>
+        <w:t xml:space="preserve">Ensure the </w:t>
+      </w:r>
       <w:r>
         <w:rPr>
           <w:rFonts w:ascii="Calibri" w:eastAsia="Times New Roman" w:hAnsi="Calibri" w:cs="Calibri"/>
@@ -3671,62 +3784,55 @@
         </w:rPr>
         <w:t>Scale</w:t>
       </w:r>
-      <w:proofErr w:type="gramEnd"/>
-      <w:r>
-        <w:rPr>
-          <w:rFonts w:ascii="Calibri" w:eastAsia="Times New Roman" w:hAnsi="Calibri" w:cs="Calibri"/>
-          <w:kern w:val="0"/>
-          <w14:ligatures w14:val="none"/>
-        </w:rPr>
-        <w:t xml:space="preserve"> is </w:t>
-      </w:r>
-      <w:r>
-        <w:rPr>
-          <w:rFonts w:ascii="Calibri" w:eastAsia="Times New Roman" w:hAnsi="Calibri" w:cs="Calibri"/>
-          <w:b/>
-          <w:bCs/>
-          <w:kern w:val="0"/>
-          <w14:ligatures w14:val="none"/>
-        </w:rPr>
-        <w:t xml:space="preserve">100% </w:t>
-      </w:r>
-      <w:r>
-        <w:rPr>
-          <w:rFonts w:ascii="Calibri" w:eastAsia="Times New Roman" w:hAnsi="Calibri" w:cs="Calibri"/>
-          <w:kern w:val="0"/>
-          <w14:ligatures w14:val="none"/>
-        </w:rPr>
-        <w:t xml:space="preserve">(your </w:t>
-      </w:r>
-      <w:proofErr w:type="gramStart"/>
-      <w:r>
-        <w:rPr>
-          <w:rFonts w:ascii="Calibri" w:eastAsia="Times New Roman" w:hAnsi="Calibri" w:cs="Calibri"/>
-          <w:kern w:val="0"/>
-          <w14:ligatures w14:val="none"/>
-        </w:rPr>
-        <w:t>project</w:t>
-      </w:r>
-      <w:r>
-        <w:rPr>
-          <w:rFonts w:ascii="Calibri" w:eastAsia="Times New Roman" w:hAnsi="Calibri" w:cs="Calibri"/>
-          <w:kern w:val="0"/>
-          <w14:ligatures w14:val="none"/>
-        </w:rPr>
-        <w:t>s</w:t>
-      </w:r>
-      <w:proofErr w:type="gramEnd"/>
-      <w:r>
-        <w:rPr>
-          <w:rFonts w:ascii="Calibri" w:eastAsia="Times New Roman" w:hAnsi="Calibri" w:cs="Calibri"/>
-          <w:kern w:val="0"/>
-          <w14:ligatures w14:val="none"/>
-        </w:rPr>
-        <w:t xml:space="preserve"> native scale). </w:t>
-      </w:r>
-    </w:p>
-    <w:p>
-      <w:pPr>
+      <w:r>
+        <w:rPr>
+          <w:rFonts w:ascii="Calibri" w:eastAsia="Times New Roman" w:hAnsi="Calibri" w:cs="Calibri"/>
+          <w:kern w:val="0"/>
+          <w14:ligatures w14:val="none"/>
+        </w:rPr>
+        <w:t xml:space="preserve"> is set to </w:t>
+      </w:r>
+      <w:r>
+        <w:rPr>
+          <w:rFonts w:ascii="Calibri" w:eastAsia="Times New Roman" w:hAnsi="Calibri" w:cs="Calibri"/>
+          <w:b/>
+          <w:bCs/>
+          <w:kern w:val="0"/>
+          <w14:ligatures w14:val="none"/>
+        </w:rPr>
+        <w:t>100%</w:t>
+      </w:r>
+      <w:r>
+        <w:rPr>
+          <w:rFonts w:ascii="Calibri" w:eastAsia="Times New Roman" w:hAnsi="Calibri" w:cs="Calibri"/>
+          <w:kern w:val="0"/>
+          <w14:ligatures w14:val="none"/>
+        </w:rPr>
+        <w:t xml:space="preserve"> to match your project</w:t>
+      </w:r>
+      <w:r>
+        <w:rPr>
+          <w:rFonts w:ascii="Calibri" w:eastAsia="Times New Roman" w:hAnsi="Calibri" w:cs="Calibri"/>
+          <w:kern w:val="0"/>
+          <w14:ligatures w14:val="none"/>
+        </w:rPr>
+        <w:t>’</w:t>
+      </w:r>
+      <w:r>
+        <w:rPr>
+          <w:rFonts w:ascii="Calibri" w:eastAsia="Times New Roman" w:hAnsi="Calibri" w:cs="Calibri"/>
+          <w:kern w:val="0"/>
+          <w14:ligatures w14:val="none"/>
+        </w:rPr>
+        <w:t>s native resolution.</w:t>
+      </w:r>
+    </w:p>
+    <w:p>
+      <w:pPr>
+        <w:numPr>
+          <w:ilvl w:val="0"/>
+          <w:numId w:val="8"/>
+        </w:numPr>
         <w:spacing w:line="360" w:lineRule="auto"/>
         <w:rPr>
           <w:rFonts w:ascii="Calibri" w:eastAsia="Times New Roman" w:hAnsi="Calibri" w:cs="Calibri"/>
@@ -3740,91 +3846,43 @@
           <w:kern w:val="0"/>
           <w14:ligatures w14:val="none"/>
         </w:rPr>
-        <w:t xml:space="preserve">Set </w:t>
-      </w:r>
-      <w:r>
-        <w:rPr>
-          <w:rFonts w:ascii="Calibri" w:eastAsia="Times New Roman" w:hAnsi="Calibri" w:cs="Calibri"/>
-          <w:b/>
-          <w:bCs/>
-          <w:kern w:val="0"/>
-          <w14:ligatures w14:val="none"/>
-        </w:rPr>
-        <w:t xml:space="preserve">Output Path, </w:t>
-      </w:r>
-      <w:r>
-        <w:rPr>
-          <w:rFonts w:ascii="Calibri" w:eastAsia="Times New Roman" w:hAnsi="Calibri" w:cs="Calibri"/>
-          <w:kern w:val="0"/>
-          <w14:ligatures w14:val="none"/>
-        </w:rPr>
-        <w:t xml:space="preserve">where will be </w:t>
-      </w:r>
-      <w:proofErr w:type="gramStart"/>
-      <w:r>
-        <w:rPr>
-          <w:rFonts w:ascii="Calibri" w:eastAsia="Times New Roman" w:hAnsi="Calibri" w:cs="Calibri"/>
-          <w:kern w:val="0"/>
-          <w14:ligatures w14:val="none"/>
-        </w:rPr>
-        <w:t>yours</w:t>
-      </w:r>
-      <w:r>
-        <w:rPr>
-          <w:rFonts w:ascii="Calibri" w:eastAsia="Times New Roman" w:hAnsi="Calibri" w:cs="Calibri"/>
-          <w:kern w:val="0"/>
-          <w14:ligatures w14:val="none"/>
-        </w:rPr>
-        <w:t xml:space="preserve"> </w:t>
-      </w:r>
-      <w:r>
-        <w:rPr>
-          <w:rFonts w:ascii="Calibri" w:eastAsia="Times New Roman" w:hAnsi="Calibri" w:cs="Calibri"/>
-          <w:b/>
-          <w:bCs/>
-          <w:kern w:val="0"/>
-          <w14:ligatures w14:val="none"/>
-        </w:rPr>
-        <w:t>.</w:t>
-      </w:r>
-      <w:proofErr w:type="spellStart"/>
-      <w:r>
-        <w:rPr>
-          <w:rFonts w:ascii="Calibri" w:eastAsia="Times New Roman" w:hAnsi="Calibri" w:cs="Calibri"/>
-          <w:b/>
-          <w:bCs/>
-          <w:kern w:val="0"/>
-          <w14:ligatures w14:val="none"/>
-        </w:rPr>
-        <w:t>json</w:t>
-      </w:r>
-      <w:proofErr w:type="spellEnd"/>
-      <w:proofErr w:type="gramEnd"/>
-      <w:r>
-        <w:rPr>
-          <w:rFonts w:ascii="Calibri" w:eastAsia="Times New Roman" w:hAnsi="Calibri" w:cs="Calibri"/>
-          <w:kern w:val="0"/>
-          <w14:ligatures w14:val="none"/>
-        </w:rPr>
-        <w:t xml:space="preserve"> and </w:t>
-      </w:r>
-      <w:r>
-        <w:rPr>
-          <w:rFonts w:ascii="Calibri" w:eastAsia="Times New Roman" w:hAnsi="Calibri" w:cs="Calibri"/>
-          <w:b/>
-          <w:bCs/>
-          <w:kern w:val="0"/>
-          <w14:ligatures w14:val="none"/>
-        </w:rPr>
-        <w:t>images</w:t>
-      </w:r>
-      <w:r>
-        <w:rPr>
-          <w:rFonts w:ascii="Calibri" w:eastAsia="Times New Roman" w:hAnsi="Calibri" w:cs="Calibri"/>
-          <w:kern w:val="0"/>
-          <w14:ligatures w14:val="none"/>
-        </w:rPr>
-        <w:t xml:space="preserve"> files</w:t>
+        <w:t xml:space="preserve">Set the </w:t>
+      </w:r>
+      <w:r>
+        <w:rPr>
+          <w:rFonts w:ascii="Calibri" w:eastAsia="Times New Roman" w:hAnsi="Calibri" w:cs="Calibri"/>
+          <w:b/>
+          <w:bCs/>
+          <w:kern w:val="0"/>
+          <w14:ligatures w14:val="none"/>
+        </w:rPr>
+        <w:t>Output Path</w:t>
+      </w:r>
+      <w:r>
+        <w:rPr>
+          <w:rFonts w:ascii="Calibri" w:eastAsia="Times New Roman" w:hAnsi="Calibri" w:cs="Calibri"/>
+          <w:kern w:val="0"/>
+          <w14:ligatures w14:val="none"/>
+        </w:rPr>
+        <w:t xml:space="preserve">, which will be used to save the generated </w:t>
+      </w:r>
+      <w:r>
+        <w:rPr>
+          <w:rFonts w:ascii="Calibri" w:eastAsia="Times New Roman" w:hAnsi="Calibri" w:cs="Calibri"/>
+          <w:i/>
+          <w:iCs/>
+          <w:kern w:val="0"/>
+          <w14:ligatures w14:val="none"/>
+        </w:rPr>
+        <w:t>.json</w:t>
+      </w:r>
+      <w:r>
+        <w:rPr>
+          <w:rFonts w:ascii="Calibri" w:eastAsia="Times New Roman" w:hAnsi="Calibri" w:cs="Calibri"/>
+          <w:kern w:val="0"/>
+          <w14:ligatures w14:val="none"/>
+        </w:rPr>
+        <w:t xml:space="preserve"> file and the exported image assets.</w:t>
       </w:r>
     </w:p>
     <w:p>
@@ -3882,19 +3940,17 @@
     </w:p>
     <w:p>
       <w:pPr>
-        <w:rPr>
-          <w:rFonts w:ascii="Calibri" w:eastAsia="Times New Roman" w:hAnsi="Calibri" w:cs="Calibri"/>
-          <w:kern w:val="0"/>
-          <w14:ligatures w14:val="none"/>
-        </w:rPr>
-      </w:pPr>
-      <w:r>
-        <w:rPr>
-          <w:rFonts w:ascii="Calibri" w:eastAsia="Times New Roman" w:hAnsi="Calibri" w:cs="Calibri"/>
-          <w:kern w:val="0"/>
-          <w14:ligatures w14:val="none"/>
-        </w:rPr>
-        <w:br w:type="page"/>
+        <w:pStyle w:val="Heading1"/>
+        <w:rPr>
+          <w:rFonts w:eastAsia="Times New Roman"/>
+        </w:rPr>
+      </w:pPr>
+      <w:r>
+        <w:rPr>
+          <w:rFonts w:eastAsia="Times New Roman"/>
+        </w:rPr>
+        <w:lastRenderedPageBreak/>
+        <w:t>Alternative Export Methods (e.g., for Adobe Animate)</w:t>
       </w:r>
     </w:p>
     <w:p>
@@ -3912,7 +3968,6 @@
           <w:kern w:val="0"/>
           <w14:ligatures w14:val="none"/>
         </w:rPr>
-        <w:lastRenderedPageBreak/>
         <w:t>To export in another method (for example to use in future in Adobe Animate) use</w:t>
       </w:r>
     </w:p>
@@ -4401,13 +4456,7 @@
           <w:bCs/>
           <w:color w:val="4EA72E" w:themeColor="accent6"/>
         </w:rPr>
-        <w:t>with layered groups</w:t>
-      </w:r>
-      <w:r>
-        <w:rPr>
-          <w:rFonts w:ascii="Calibri" w:hAnsi="Calibri" w:cs="Calibri"/>
-        </w:rPr>
-        <w:t xml:space="preserve">, or </w:t>
+        <w:t xml:space="preserve">with layered </w:t>
       </w:r>
       <w:r>
         <w:rPr>
@@ -4416,7 +4465,37 @@
           <w:bCs/>
           <w:color w:val="4EA72E" w:themeColor="accent6"/>
         </w:rPr>
+        <w:t>groups</w:t>
+      </w:r>
+      <w:r>
+        <w:rPr>
+          <w:rFonts w:ascii="Calibri" w:hAnsi="Calibri" w:cs="Calibri"/>
+        </w:rPr>
+        <w:t xml:space="preserve"> or</w:t>
+      </w:r>
+      <w:r>
+        <w:rPr>
+          <w:rFonts w:ascii="Calibri" w:hAnsi="Calibri" w:cs="Calibri"/>
+        </w:rPr>
+        <w:t xml:space="preserve"> </w:t>
+      </w:r>
+      <w:r>
+        <w:rPr>
+          <w:rFonts w:ascii="Calibri" w:hAnsi="Calibri" w:cs="Calibri"/>
+          <w:b/>
+          <w:bCs/>
+          <w:color w:val="4EA72E" w:themeColor="accent6"/>
+        </w:rPr>
         <w:t>separate</w:t>
+      </w:r>
+      <w:r>
+        <w:rPr>
+          <w:rFonts w:ascii="Calibri" w:hAnsi="Calibri" w:cs="Calibri"/>
+          <w:b/>
+          <w:bCs/>
+          <w:color w:val="4EA72E" w:themeColor="accent6"/>
+        </w:rPr>
+        <w:t>d</w:t>
       </w:r>
       <w:r>
         <w:rPr>
@@ -4441,6 +4520,14 @@
           <w:b/>
           <w:bCs/>
         </w:rPr>
+        <w:t xml:space="preserve">Use: </w:t>
+      </w:r>
+      <w:r>
+        <w:rPr>
+          <w:rFonts w:ascii="Calibri" w:hAnsi="Calibri" w:cs="Calibri"/>
+          <w:b/>
+          <w:bCs/>
+        </w:rPr>
         <w:t>File → Import → Import to Library</w:t>
       </w:r>
     </w:p>
@@ -4464,6 +4551,54 @@
         </w:rPr>
         <w:t xml:space="preserve"> Photoshop layer groups = Timeline layers in Animate.</w:t>
       </w:r>
+      <w:r>
+        <w:rPr>
+          <w:rFonts w:ascii="Calibri" w:hAnsi="Calibri" w:cs="Calibri"/>
+        </w:rPr>
+        <w:t xml:space="preserve"> (</w:t>
+      </w:r>
+      <w:r>
+        <w:rPr>
+          <w:rFonts w:ascii="Calibri" w:hAnsi="Calibri" w:cs="Calibri"/>
+          <w:b/>
+          <w:bCs/>
+        </w:rPr>
+        <w:t>Photoshop layer groups</w:t>
+      </w:r>
+      <w:r>
+        <w:rPr>
+          <w:rFonts w:ascii="Calibri" w:hAnsi="Calibri" w:cs="Calibri"/>
+        </w:rPr>
+        <w:t xml:space="preserve"> will be automatically converted into </w:t>
+      </w:r>
+      <w:r>
+        <w:rPr>
+          <w:rFonts w:ascii="Calibri" w:hAnsi="Calibri" w:cs="Calibri"/>
+          <w:b/>
+          <w:bCs/>
+          <w:color w:val="000000" w:themeColor="text1"/>
+        </w:rPr>
+        <w:t>timeline layers</w:t>
+      </w:r>
+      <w:r>
+        <w:rPr>
+          <w:rFonts w:ascii="Calibri" w:hAnsi="Calibri" w:cs="Calibri"/>
+          <w:color w:val="000000" w:themeColor="text1"/>
+        </w:rPr>
+        <w:t xml:space="preserve"> </w:t>
+      </w:r>
+      <w:r>
+        <w:rPr>
+          <w:rFonts w:ascii="Calibri" w:hAnsi="Calibri" w:cs="Calibri"/>
+        </w:rPr>
+        <w:t>in Adobe Animate</w:t>
+      </w:r>
+      <w:r>
+        <w:rPr>
+          <w:rFonts w:ascii="Calibri" w:hAnsi="Calibri" w:cs="Calibri"/>
+        </w:rPr>
+        <w:t>.)</w:t>
+      </w:r>
     </w:p>
     <w:p>
       <w:pPr>
@@ -4482,6 +4617,7 @@
       <w:r>
         <w:rPr>
           <w:rFonts w:ascii="Calibri" w:hAnsi="Calibri" w:cs="Calibri"/>
+          <w:color w:val="4EA72E" w:themeColor="accent6"/>
         </w:rPr>
         <w:t xml:space="preserve"> </w:t>
       </w:r>
@@ -4492,13 +4628,13 @@
           <w:bCs/>
           <w:color w:val="4EA72E" w:themeColor="accent6"/>
         </w:rPr>
-        <w:t>Avoid</w:t>
-      </w:r>
-      <w:r>
-        <w:rPr>
-          <w:rFonts w:ascii="Calibri" w:hAnsi="Calibri" w:cs="Calibri"/>
-        </w:rPr>
-        <w:t xml:space="preserve"> complex layer effects or filters that Animate may not support (e.g. heavy shadows or layer styles).</w:t>
+        <w:t xml:space="preserve">Avoid </w:t>
+      </w:r>
+      <w:r>
+        <w:rPr>
+          <w:rFonts w:ascii="Calibri" w:hAnsi="Calibri" w:cs="Calibri"/>
+        </w:rPr>
+        <w:t>using complex layer effects or filters that are not supported in Animate (e.g., heavy shadows, glow, bevel, or other Photoshop-specific styles).</w:t>
       </w:r>
     </w:p>
     <w:p>
@@ -4529,21 +4665,37 @@
         <w:rPr>
           <w:rFonts w:ascii="Calibri" w:hAnsi="Calibri" w:cs="Calibri"/>
         </w:rPr>
-        <w:t xml:space="preserve">Use clear and </w:t>
-      </w:r>
-      <w:proofErr w:type="gramStart"/>
-      <w:r>
-        <w:rPr>
-          <w:rFonts w:ascii="Calibri" w:hAnsi="Calibri" w:cs="Calibri"/>
-        </w:rPr>
-        <w:t>understandable for other developers</w:t>
-      </w:r>
-      <w:proofErr w:type="gramEnd"/>
-      <w:r>
-        <w:rPr>
-          <w:rFonts w:ascii="Calibri" w:hAnsi="Calibri" w:cs="Calibri"/>
-        </w:rPr>
-        <w:t xml:space="preserve"> prefixes to categorize layers:</w:t>
+        <w:t xml:space="preserve">Use clear and understandable </w:t>
+      </w:r>
+      <w:r>
+        <w:rPr>
+          <w:rFonts w:ascii="Calibri" w:hAnsi="Calibri" w:cs="Calibri"/>
+        </w:rPr>
+        <w:t>prefixes</w:t>
+      </w:r>
+      <w:r>
+        <w:rPr>
+          <w:rFonts w:ascii="Calibri" w:hAnsi="Calibri" w:cs="Calibri"/>
+        </w:rPr>
+        <w:t xml:space="preserve"> </w:t>
+      </w:r>
+      <w:r>
+        <w:rPr>
+          <w:rFonts w:ascii="Calibri" w:hAnsi="Calibri" w:cs="Calibri"/>
+        </w:rPr>
+        <w:t>for other developers</w:t>
+      </w:r>
+      <w:r>
+        <w:rPr>
+          <w:rFonts w:ascii="Calibri" w:hAnsi="Calibri" w:cs="Calibri"/>
+        </w:rPr>
+        <w:t xml:space="preserve"> </w:t>
+      </w:r>
+      <w:r>
+        <w:rPr>
+          <w:rFonts w:ascii="Calibri" w:hAnsi="Calibri" w:cs="Calibri"/>
+        </w:rPr>
+        <w:t>to categorize layers:</w:t>
       </w:r>
     </w:p>
     <w:p>
@@ -4577,19 +4729,11 @@
           <w:rFonts w:ascii="Calibri" w:hAnsi="Calibri" w:cs="Calibri"/>
         </w:rPr>
       </w:pPr>
-      <w:proofErr w:type="spellStart"/>
-      <w:r>
-        <w:rPr>
-          <w:rFonts w:ascii="Calibri" w:hAnsi="Calibri" w:cs="Calibri"/>
-        </w:rPr>
-        <w:t>ui</w:t>
-      </w:r>
-      <w:proofErr w:type="spellEnd"/>
-      <w:r>
-        <w:rPr>
-          <w:rFonts w:ascii="Calibri" w:hAnsi="Calibri" w:cs="Calibri"/>
-        </w:rPr>
-        <w:t>_ – for interface elements</w:t>
+      <w:r>
+        <w:rPr>
+          <w:rFonts w:ascii="Calibri" w:hAnsi="Calibri" w:cs="Calibri"/>
+        </w:rPr>
+        <w:t>ui_ – for interface elements</w:t>
       </w:r>
     </w:p>
     <w:p>
@@ -4604,19 +4748,11 @@
           <w:rFonts w:ascii="Calibri" w:hAnsi="Calibri" w:cs="Calibri"/>
         </w:rPr>
       </w:pPr>
-      <w:proofErr w:type="spellStart"/>
-      <w:r>
-        <w:rPr>
-          <w:rFonts w:ascii="Calibri" w:hAnsi="Calibri" w:cs="Calibri"/>
-        </w:rPr>
-        <w:t>btn</w:t>
-      </w:r>
-      <w:proofErr w:type="spellEnd"/>
-      <w:r>
-        <w:rPr>
-          <w:rFonts w:ascii="Calibri" w:hAnsi="Calibri" w:cs="Calibri"/>
-        </w:rPr>
-        <w:t xml:space="preserve"> – for buttons</w:t>
+      <w:r>
+        <w:rPr>
+          <w:rFonts w:ascii="Calibri" w:hAnsi="Calibri" w:cs="Calibri"/>
+        </w:rPr>
+        <w:t>btn – for buttons</w:t>
       </w:r>
     </w:p>
     <w:p>
@@ -4667,9 +4803,9 @@
           <w:noProof/>
         </w:rPr>
         <w:drawing>
-          <wp:inline distT="0" distB="0" distL="0" distR="0" wp14:anchorId="79A2A0A5" wp14:editId="6A21ADB3">
-            <wp:extent cx="2590800" cy="2417620"/>
-            <wp:effectExtent l="0" t="0" r="0" b="1905"/>
+          <wp:inline distT="0" distB="0" distL="0" distR="0" wp14:anchorId="79A2A0A5" wp14:editId="6BD9F96E">
+            <wp:extent cx="2505875" cy="2338372"/>
+            <wp:effectExtent l="0" t="0" r="8890" b="5080"/>
             <wp:docPr id="934412070" name="Picture 1" descr="A screenshot of a computer&#10;&#10;AI-generated content may be incorrect."/>
             <wp:cNvGraphicFramePr>
               <a:graphicFrameLocks xmlns:a="http://schemas.openxmlformats.org/drawingml/2006/main" noChangeAspect="1"/>
@@ -4690,7 +4826,7 @@
                   <pic:spPr>
                     <a:xfrm>
                       <a:off x="0" y="0"/>
-                      <a:ext cx="2600081" cy="2426281"/>
+                      <a:ext cx="2516200" cy="2348007"/>
                     </a:xfrm>
                     <a:prstGeom prst="rect">
                       <a:avLst/>
@@ -5095,7 +5231,19 @@
         <w:rPr>
           <w:rFonts w:cs="Calibri"/>
         </w:rPr>
-        <w:t>Importing from Photoshop (via Script)</w:t>
+        <w:t>Importing from Photoshop (via Script</w:t>
+      </w:r>
+      <w:r>
+        <w:rPr>
+          <w:rFonts w:cs="Calibri"/>
+        </w:rPr>
+        <w:t xml:space="preserve"> before</w:t>
+      </w:r>
+      <w:r>
+        <w:rPr>
+          <w:rFonts w:cs="Calibri"/>
+        </w:rPr>
+        <w:t>)</w:t>
       </w:r>
       <w:bookmarkEnd w:id="7"/>
     </w:p>
@@ -5160,7 +5308,29 @@
         <w:rPr>
           <w:rFonts w:ascii="Calibri" w:hAnsi="Calibri" w:cs="Calibri"/>
         </w:rPr>
-        <w:t xml:space="preserve"> exported .JSON file from Photoshop script saved.</w:t>
+        <w:t xml:space="preserve"> exported </w:t>
+      </w:r>
+      <w:r>
+        <w:rPr>
+          <w:rFonts w:ascii="Calibri" w:hAnsi="Calibri" w:cs="Calibri"/>
+          <w:i/>
+          <w:iCs/>
+        </w:rPr>
+        <w:t>.</w:t>
+      </w:r>
+      <w:r>
+        <w:rPr>
+          <w:rFonts w:ascii="Calibri" w:hAnsi="Calibri" w:cs="Calibri"/>
+          <w:i/>
+          <w:iCs/>
+        </w:rPr>
+        <w:t>json</w:t>
+      </w:r>
+      <w:r>
+        <w:rPr>
+          <w:rFonts w:ascii="Calibri" w:hAnsi="Calibri" w:cs="Calibri"/>
+        </w:rPr>
+        <w:t xml:space="preserve"> file from Photoshop script saved.</w:t>
       </w:r>
     </w:p>
     <w:p>
@@ -6623,54 +6793,8 @@
           <w:b/>
           <w:bCs/>
         </w:rPr>
-        <w:t xml:space="preserve">→ </w:t>
-      </w:r>
-      <w:proofErr w:type="spellStart"/>
-      <w:r>
-        <w:rPr>
-          <w:rFonts w:ascii="Calibri" w:hAnsi="Calibri" w:cs="Calibri"/>
-          <w:b/>
-          <w:bCs/>
-        </w:rPr>
-        <w:t>LeftArm</w:t>
-      </w:r>
-      <w:proofErr w:type="spellEnd"/>
-      <w:r>
-        <w:rPr>
-          <w:rFonts w:ascii="Calibri" w:hAnsi="Calibri" w:cs="Calibri"/>
-          <w:b/>
-          <w:bCs/>
-        </w:rPr>
-        <w:t xml:space="preserve"> → </w:t>
-      </w:r>
-      <w:proofErr w:type="spellStart"/>
-      <w:r>
-        <w:rPr>
-          <w:rFonts w:ascii="Calibri" w:hAnsi="Calibri" w:cs="Calibri"/>
-          <w:b/>
-          <w:bCs/>
-        </w:rPr>
-        <w:t>LeftForearm</w:t>
-      </w:r>
-      <w:proofErr w:type="spellEnd"/>
-      <w:r>
-        <w:rPr>
-          <w:rFonts w:ascii="Calibri" w:hAnsi="Calibri" w:cs="Calibri"/>
-          <w:b/>
-          <w:bCs/>
-        </w:rPr>
-        <w:t xml:space="preserve"> → </w:t>
-      </w:r>
-      <w:proofErr w:type="spellStart"/>
-      <w:r>
-        <w:rPr>
-          <w:rFonts w:ascii="Calibri" w:hAnsi="Calibri" w:cs="Calibri"/>
-          <w:b/>
-          <w:bCs/>
-        </w:rPr>
-        <w:t>LeftHand</w:t>
-      </w:r>
-      <w:proofErr w:type="spellEnd"/>
+        <w:t>→ LeftArm → LeftForearm → LeftHand</w:t>
+      </w:r>
     </w:p>
     <w:p>
       <w:pPr>
@@ -7297,7 +7421,30 @@
           <w:rFonts w:ascii="Calibri" w:hAnsi="Calibri" w:cs="Calibri"/>
           <w:color w:val="000000" w:themeColor="text1"/>
         </w:rPr>
-        <w:t>Check JSON if you need to integrate assets in future development environments</w:t>
+        <w:t>Check</w:t>
+      </w:r>
+      <w:r>
+        <w:rPr>
+          <w:rFonts w:ascii="Calibri" w:hAnsi="Calibri" w:cs="Calibri"/>
+          <w:color w:val="000000" w:themeColor="text1"/>
+        </w:rPr>
+        <w:t xml:space="preserve"> </w:t>
+      </w:r>
+      <w:r>
+        <w:rPr>
+          <w:rFonts w:ascii="Calibri" w:hAnsi="Calibri" w:cs="Calibri"/>
+          <w:i/>
+          <w:iCs/>
+          <w:color w:val="000000" w:themeColor="text1"/>
+        </w:rPr>
+        <w:t>.json</w:t>
+      </w:r>
+      <w:r>
+        <w:rPr>
+          <w:rFonts w:ascii="Calibri" w:hAnsi="Calibri" w:cs="Calibri"/>
+          <w:color w:val="000000" w:themeColor="text1"/>
+        </w:rPr>
+        <w:t xml:space="preserve"> if you need to integrate assets in future development environments</w:t>
       </w:r>
     </w:p>
     <w:p>
@@ -7329,23 +7476,7 @@
           <w:rFonts w:ascii="Calibri" w:hAnsi="Calibri" w:cs="Calibri"/>
           <w:color w:val="000000" w:themeColor="text1"/>
         </w:rPr>
-        <w:t>where will be located .</w:t>
-      </w:r>
-      <w:proofErr w:type="spellStart"/>
-      <w:r>
-        <w:rPr>
-          <w:rFonts w:ascii="Calibri" w:hAnsi="Calibri" w:cs="Calibri"/>
-          <w:color w:val="000000" w:themeColor="text1"/>
-        </w:rPr>
-        <w:t>json</w:t>
-      </w:r>
-      <w:proofErr w:type="spellEnd"/>
-      <w:r>
-        <w:rPr>
-          <w:rFonts w:ascii="Calibri" w:hAnsi="Calibri" w:cs="Calibri"/>
-          <w:color w:val="000000" w:themeColor="text1"/>
-        </w:rPr>
-        <w:t xml:space="preserve"> file of project</w:t>
+        <w:t>where will be located .json file of project</w:t>
       </w:r>
       <w:r>
         <w:rPr>
@@ -7497,25 +7628,14 @@
         </w:rPr>
         <w:t xml:space="preserve"> or </w:t>
       </w:r>
-      <w:proofErr w:type="gramStart"/>
-      <w:r>
-        <w:rPr>
-          <w:rFonts w:ascii="Calibri" w:hAnsi="Calibri" w:cs="Calibri"/>
-          <w:b/>
-          <w:bCs/>
-          <w:color w:val="000000" w:themeColor="text1"/>
-        </w:rPr>
-        <w:t>Add</w:t>
-      </w:r>
-      <w:proofErr w:type="gramEnd"/>
-      <w:r>
-        <w:rPr>
-          <w:rFonts w:ascii="Calibri" w:hAnsi="Calibri" w:cs="Calibri"/>
-          <w:b/>
-          <w:bCs/>
-          <w:color w:val="000000" w:themeColor="text1"/>
-        </w:rPr>
-        <w:t xml:space="preserve"> smart folder</w:t>
+      <w:r>
+        <w:rPr>
+          <w:rFonts w:ascii="Calibri" w:hAnsi="Calibri" w:cs="Calibri"/>
+          <w:b/>
+          <w:bCs/>
+          <w:color w:val="000000" w:themeColor="text1"/>
+        </w:rPr>
+        <w:t>Add smart folder</w:t>
       </w:r>
       <w:r>
         <w:rPr>
@@ -7780,7 +7900,6 @@
         </w:rPr>
         <w:t xml:space="preserve">Or you can adjust it manually by selecting each asset in </w:t>
       </w:r>
-      <w:proofErr w:type="gramStart"/>
       <w:r>
         <w:rPr>
           <w:rFonts w:ascii="Calibri" w:hAnsi="Calibri" w:cs="Calibri"/>
@@ -7790,7 +7909,6 @@
         </w:rPr>
         <w:t>Sprite</w:t>
       </w:r>
-      <w:proofErr w:type="gramEnd"/>
       <w:r>
         <w:rPr>
           <w:rFonts w:ascii="Calibri" w:hAnsi="Calibri" w:cs="Calibri"/>
@@ -7810,23 +7928,7 @@
           <w:rFonts w:ascii="Calibri" w:hAnsi="Calibri" w:cs="Calibri"/>
           <w:color w:val="000000" w:themeColor="text1"/>
         </w:rPr>
-        <w:t xml:space="preserve"> </w:t>
-      </w:r>
-      <w:proofErr w:type="gramStart"/>
-      <w:r>
-        <w:rPr>
-          <w:rFonts w:ascii="Calibri" w:hAnsi="Calibri" w:cs="Calibri"/>
-          <w:color w:val="000000" w:themeColor="text1"/>
-        </w:rPr>
-        <w:t>pivot</w:t>
-      </w:r>
-      <w:proofErr w:type="gramEnd"/>
-      <w:r>
-        <w:rPr>
-          <w:rFonts w:ascii="Calibri" w:hAnsi="Calibri" w:cs="Calibri"/>
-          <w:color w:val="000000" w:themeColor="text1"/>
-        </w:rPr>
-        <w:t xml:space="preserve"> point. </w:t>
+        <w:t xml:space="preserve"> pivot point. </w:t>
       </w:r>
     </w:p>
     <w:p>
@@ -8129,23 +8231,7 @@
           <w:rFonts w:ascii="Calibri" w:hAnsi="Calibri" w:cs="Calibri"/>
           <w:color w:val="000000" w:themeColor="text1"/>
         </w:rPr>
-        <w:t xml:space="preserve"> (e.g. </w:t>
-      </w:r>
-      <w:proofErr w:type="spellStart"/>
-      <w:r>
-        <w:rPr>
-          <w:rFonts w:ascii="Calibri" w:hAnsi="Calibri" w:cs="Calibri"/>
-          <w:color w:val="000000" w:themeColor="text1"/>
-        </w:rPr>
-        <w:t>PixiJS</w:t>
-      </w:r>
-      <w:proofErr w:type="spellEnd"/>
-      <w:r>
-        <w:rPr>
-          <w:rFonts w:ascii="Calibri" w:hAnsi="Calibri" w:cs="Calibri"/>
-          <w:color w:val="000000" w:themeColor="text1"/>
-        </w:rPr>
-        <w:t>)</w:t>
+        <w:t xml:space="preserve"> (e.g. PixiJS)</w:t>
       </w:r>
     </w:p>
     <w:p>
@@ -8841,6 +8927,119 @@
     </w:lvl>
   </w:abstractNum>
   <w:abstractNum w:abstractNumId="1" w15:restartNumberingAfterBreak="0">
+    <w:nsid w:val="21FE3CE6"/>
+    <w:multiLevelType w:val="multilevel"/>
+    <w:tmpl w:val="2CE6DC22"/>
+    <w:lvl w:ilvl="0">
+      <w:start w:val="1"/>
+      <w:numFmt w:val="decimal"/>
+      <w:lvlText w:val="%1."/>
+      <w:lvlJc w:val="left"/>
+      <w:pPr>
+        <w:tabs>
+          <w:tab w:val="num" w:pos="720"/>
+        </w:tabs>
+        <w:ind w:left="720" w:hanging="360"/>
+      </w:pPr>
+    </w:lvl>
+    <w:lvl w:ilvl="1" w:tentative="1">
+      <w:start w:val="1"/>
+      <w:numFmt w:val="decimal"/>
+      <w:lvlText w:val="%2."/>
+      <w:lvlJc w:val="left"/>
+      <w:pPr>
+        <w:tabs>
+          <w:tab w:val="num" w:pos="1440"/>
+        </w:tabs>
+        <w:ind w:left="1440" w:hanging="360"/>
+      </w:pPr>
+    </w:lvl>
+    <w:lvl w:ilvl="2" w:tentative="1">
+      <w:start w:val="1"/>
+      <w:numFmt w:val="decimal"/>
+      <w:lvlText w:val="%3."/>
+      <w:lvlJc w:val="left"/>
+      <w:pPr>
+        <w:tabs>
+          <w:tab w:val="num" w:pos="2160"/>
+        </w:tabs>
+        <w:ind w:left="2160" w:hanging="360"/>
+      </w:pPr>
+    </w:lvl>
+    <w:lvl w:ilvl="3" w:tentative="1">
+      <w:start w:val="1"/>
+      <w:numFmt w:val="decimal"/>
+      <w:lvlText w:val="%4."/>
+      <w:lvlJc w:val="left"/>
+      <w:pPr>
+        <w:tabs>
+          <w:tab w:val="num" w:pos="2880"/>
+        </w:tabs>
+        <w:ind w:left="2880" w:hanging="360"/>
+      </w:pPr>
+    </w:lvl>
+    <w:lvl w:ilvl="4" w:tentative="1">
+      <w:start w:val="1"/>
+      <w:numFmt w:val="decimal"/>
+      <w:lvlText w:val="%5."/>
+      <w:lvlJc w:val="left"/>
+      <w:pPr>
+        <w:tabs>
+          <w:tab w:val="num" w:pos="3600"/>
+        </w:tabs>
+        <w:ind w:left="3600" w:hanging="360"/>
+      </w:pPr>
+    </w:lvl>
+    <w:lvl w:ilvl="5" w:tentative="1">
+      <w:start w:val="1"/>
+      <w:numFmt w:val="decimal"/>
+      <w:lvlText w:val="%6."/>
+      <w:lvlJc w:val="left"/>
+      <w:pPr>
+        <w:tabs>
+          <w:tab w:val="num" w:pos="4320"/>
+        </w:tabs>
+        <w:ind w:left="4320" w:hanging="360"/>
+      </w:pPr>
+    </w:lvl>
+    <w:lvl w:ilvl="6" w:tentative="1">
+      <w:start w:val="1"/>
+      <w:numFmt w:val="decimal"/>
+      <w:lvlText w:val="%7."/>
+      <w:lvlJc w:val="left"/>
+      <w:pPr>
+        <w:tabs>
+          <w:tab w:val="num" w:pos="5040"/>
+        </w:tabs>
+        <w:ind w:left="5040" w:hanging="360"/>
+      </w:pPr>
+    </w:lvl>
+    <w:lvl w:ilvl="7" w:tentative="1">
+      <w:start w:val="1"/>
+      <w:numFmt w:val="decimal"/>
+      <w:lvlText w:val="%8."/>
+      <w:lvlJc w:val="left"/>
+      <w:pPr>
+        <w:tabs>
+          <w:tab w:val="num" w:pos="5760"/>
+        </w:tabs>
+        <w:ind w:left="5760" w:hanging="360"/>
+      </w:pPr>
+    </w:lvl>
+    <w:lvl w:ilvl="8" w:tentative="1">
+      <w:start w:val="1"/>
+      <w:numFmt w:val="decimal"/>
+      <w:lvlText w:val="%9."/>
+      <w:lvlJc w:val="left"/>
+      <w:pPr>
+        <w:tabs>
+          <w:tab w:val="num" w:pos="6480"/>
+        </w:tabs>
+        <w:ind w:left="6480" w:hanging="360"/>
+      </w:pPr>
+    </w:lvl>
+  </w:abstractNum>
+  <w:abstractNum w:abstractNumId="2" w15:restartNumberingAfterBreak="0">
     <w:nsid w:val="23147317"/>
     <w:multiLevelType w:val="multilevel"/>
     <w:tmpl w:val="17464BB4"/>
@@ -8989,7 +9188,7 @@
       </w:rPr>
     </w:lvl>
   </w:abstractNum>
-  <w:abstractNum w:abstractNumId="2" w15:restartNumberingAfterBreak="0">
+  <w:abstractNum w:abstractNumId="3" w15:restartNumberingAfterBreak="0">
     <w:nsid w:val="2C64383E"/>
     <w:multiLevelType w:val="hybridMultilevel"/>
     <w:tmpl w:val="C4D84440"/>
@@ -9102,7 +9301,7 @@
       </w:rPr>
     </w:lvl>
   </w:abstractNum>
-  <w:abstractNum w:abstractNumId="3" w15:restartNumberingAfterBreak="0">
+  <w:abstractNum w:abstractNumId="4" w15:restartNumberingAfterBreak="0">
     <w:nsid w:val="51AD2863"/>
     <w:multiLevelType w:val="hybridMultilevel"/>
     <w:tmpl w:val="52A2669C"/>
@@ -9214,7 +9413,7 @@
       </w:rPr>
     </w:lvl>
   </w:abstractNum>
-  <w:abstractNum w:abstractNumId="4" w15:restartNumberingAfterBreak="0">
+  <w:abstractNum w:abstractNumId="5" w15:restartNumberingAfterBreak="0">
     <w:nsid w:val="525666C4"/>
     <w:multiLevelType w:val="hybridMultilevel"/>
     <w:tmpl w:val="238E7AC6"/>
@@ -9303,7 +9502,7 @@
       </w:pPr>
     </w:lvl>
   </w:abstractNum>
-  <w:abstractNum w:abstractNumId="5" w15:restartNumberingAfterBreak="0">
+  <w:abstractNum w:abstractNumId="6" w15:restartNumberingAfterBreak="0">
     <w:nsid w:val="54854BBC"/>
     <w:multiLevelType w:val="multilevel"/>
     <w:tmpl w:val="8242C560"/>
@@ -9452,7 +9651,7 @@
       </w:rPr>
     </w:lvl>
   </w:abstractNum>
-  <w:abstractNum w:abstractNumId="6" w15:restartNumberingAfterBreak="0">
+  <w:abstractNum w:abstractNumId="7" w15:restartNumberingAfterBreak="0">
     <w:nsid w:val="6DF76518"/>
     <w:multiLevelType w:val="hybridMultilevel"/>
     <w:tmpl w:val="1638B2B8"/>
@@ -9566,24 +9765,27 @@
     </w:lvl>
   </w:abstractNum>
   <w:num w:numId="1" w16cid:durableId="1146968474">
-    <w:abstractNumId w:val="4"/>
+    <w:abstractNumId w:val="5"/>
   </w:num>
   <w:num w:numId="2" w16cid:durableId="1813719083">
-    <w:abstractNumId w:val="2"/>
+    <w:abstractNumId w:val="3"/>
   </w:num>
   <w:num w:numId="3" w16cid:durableId="2027705210">
-    <w:abstractNumId w:val="3"/>
+    <w:abstractNumId w:val="4"/>
   </w:num>
   <w:num w:numId="4" w16cid:durableId="282426967">
     <w:abstractNumId w:val="0"/>
   </w:num>
   <w:num w:numId="5" w16cid:durableId="158692552">
+    <w:abstractNumId w:val="7"/>
+  </w:num>
+  <w:num w:numId="6" w16cid:durableId="1421441354">
     <w:abstractNumId w:val="6"/>
   </w:num>
-  <w:num w:numId="6" w16cid:durableId="1421441354">
-    <w:abstractNumId w:val="5"/>
+  <w:num w:numId="7" w16cid:durableId="1659963014">
+    <w:abstractNumId w:val="2"/>
   </w:num>
-  <w:num w:numId="7" w16cid:durableId="1659963014">
+  <w:num w:numId="8" w16cid:durableId="1229267285">
     <w:abstractNumId w:val="1"/>
   </w:num>
 </w:numbering>
@@ -10193,7 +10395,6 @@
   <w:style w:type="character" w:default="1" w:styleId="DefaultParagraphFont">
     <w:name w:val="Default Paragraph Font"/>
     <w:uiPriority w:val="1"/>
-    <w:semiHidden/>
     <w:unhideWhenUsed/>
   </w:style>
   <w:style w:type="table" w:default="1" w:styleId="TableNormal">
@@ -10552,7 +10753,6 @@
     <w:basedOn w:val="Normal"/>
     <w:next w:val="Normal"/>
     <w:uiPriority w:val="35"/>
-    <w:semiHidden/>
     <w:unhideWhenUsed/>
     <w:qFormat/>
     <w:rsid w:val="009A1EB3"/>

</xml_diff>

<commit_message>
visual improvements (title image)
</commit_message>
<xml_diff>
--- a/Documentation_Draft.docx
+++ b/Documentation_Draft.docx
@@ -70,6 +70,39 @@
           <w14:ligatures w14:val="standardContextual"/>
         </w:rPr>
         <w:t>This documentation outlines the goals and best practices for preparing resources in Adobe Photoshop for integration with tools such as Adobe Animate and Spine.</w:t>
+      </w:r>
+      <w:r>
+        <w:rPr>
+          <w:rFonts w:eastAsiaTheme="minorHAnsi" w:cs="Calibri"/>
+          <w:color w:val="auto"/>
+          <w:kern w:val="2"/>
+          <w:sz w:val="24"/>
+          <w:szCs w:val="24"/>
+          <w14:ligatures w14:val="standardContextual"/>
+        </w:rPr>
+        <w:t xml:space="preserve"> And how</w:t>
+      </w:r>
+      <w:r>
+        <w:rPr>
+          <w:rFonts w:eastAsiaTheme="minorHAnsi" w:cs="Calibri"/>
+          <w:color w:val="auto"/>
+          <w:kern w:val="2"/>
+          <w:sz w:val="24"/>
+          <w:szCs w:val="24"/>
+          <w14:ligatures w14:val="standardContextual"/>
+        </w:rPr>
+        <w:t xml:space="preserve"> to</w:t>
+      </w:r>
+      <w:r>
+        <w:rPr>
+          <w:rFonts w:eastAsiaTheme="minorHAnsi" w:cs="Calibri"/>
+          <w:color w:val="auto"/>
+          <w:kern w:val="2"/>
+          <w:sz w:val="24"/>
+          <w:szCs w:val="24"/>
+          <w14:ligatures w14:val="standardContextual"/>
+        </w:rPr>
+        <w:t xml:space="preserve"> create sprite sheets in Texture Packer.</w:t>
       </w:r>
     </w:p>
     <w:sdt>
@@ -114,7 +147,9 @@
           <w:pPr>
             <w:pStyle w:val="TOC1"/>
             <w:rPr>
-              <w:rFonts w:eastAsiaTheme="minorEastAsia"/>
+              <w:rFonts w:asciiTheme="minorHAnsi" w:eastAsiaTheme="minorEastAsia" w:hAnsiTheme="minorHAnsi" w:cstheme="minorBidi"/>
+              <w:b w:val="0"/>
+              <w:bCs w:val="0"/>
             </w:rPr>
           </w:pPr>
           <w:r>
@@ -126,7 +161,7 @@
           <w:r>
             <w:fldChar w:fldCharType="separate"/>
           </w:r>
-          <w:hyperlink w:anchor="_Toc201602562" w:history="1">
+          <w:hyperlink w:anchor="_Toc203579027" w:history="1">
             <w:r>
               <w:rPr>
                 <w:rStyle w:val="Hyperlink"/>
@@ -149,7 +184,7 @@
               <w:rPr>
                 <w:webHidden/>
               </w:rPr>
-              <w:instrText xml:space="preserve"> PAGEREF _Toc201602562 \h </w:instrText>
+              <w:instrText xml:space="preserve"> PAGEREF _Toc203579027 \h </w:instrText>
             </w:r>
             <w:r>
               <w:rPr>
@@ -166,7 +201,7 @@
               <w:rPr>
                 <w:webHidden/>
               </w:rPr>
-              <w:t>2</w:t>
+              <w:t>3</w:t>
             </w:r>
             <w:r>
               <w:rPr>
@@ -180,15 +215,15 @@
           <w:pPr>
             <w:pStyle w:val="TOC2"/>
             <w:rPr>
-              <w:rFonts w:eastAsiaTheme="minorEastAsia"/>
+              <w:rFonts w:asciiTheme="minorHAnsi" w:eastAsiaTheme="minorEastAsia" w:hAnsiTheme="minorHAnsi" w:cstheme="minorBidi"/>
+              <w:i w:val="0"/>
+              <w:iCs w:val="0"/>
             </w:rPr>
           </w:pPr>
-          <w:hyperlink w:anchor="_Toc201602563" w:history="1">
+          <w:hyperlink w:anchor="_Toc203579028" w:history="1">
             <w:r>
               <w:rPr>
                 <w:rStyle w:val="Hyperlink"/>
-                <w:i w:val="0"/>
-                <w:iCs w:val="0"/>
               </w:rPr>
               <w:t>Layers logic and structure</w:t>
             </w:r>
@@ -208,7 +243,7 @@
               <w:rPr>
                 <w:webHidden/>
               </w:rPr>
-              <w:instrText xml:space="preserve"> PAGEREF _Toc201602563 \h </w:instrText>
+              <w:instrText xml:space="preserve"> PAGEREF _Toc203579028 \h </w:instrText>
             </w:r>
             <w:r>
               <w:rPr>
@@ -225,7 +260,7 @@
               <w:rPr>
                 <w:webHidden/>
               </w:rPr>
-              <w:t>3</w:t>
+              <w:t>4</w:t>
             </w:r>
             <w:r>
               <w:rPr>
@@ -239,10 +274,12 @@
           <w:pPr>
             <w:pStyle w:val="TOC1"/>
             <w:rPr>
-              <w:rFonts w:eastAsiaTheme="minorEastAsia"/>
+              <w:rFonts w:asciiTheme="minorHAnsi" w:eastAsiaTheme="minorEastAsia" w:hAnsiTheme="minorHAnsi" w:cstheme="minorBidi"/>
+              <w:b w:val="0"/>
+              <w:bCs w:val="0"/>
             </w:rPr>
           </w:pPr>
-          <w:hyperlink w:anchor="_Toc201602564" w:history="1">
+          <w:hyperlink w:anchor="_Toc203579029" w:history="1">
             <w:r>
               <w:rPr>
                 <w:rStyle w:val="Hyperlink"/>
@@ -266,7 +303,7 @@
               <w:rPr>
                 <w:webHidden/>
               </w:rPr>
-              <w:instrText xml:space="preserve"> PAGEREF _Toc201602564 \h </w:instrText>
+              <w:instrText xml:space="preserve"> PAGEREF _Toc203579029 \h </w:instrText>
             </w:r>
             <w:r>
               <w:rPr>
@@ -283,7 +320,7 @@
               <w:rPr>
                 <w:webHidden/>
               </w:rPr>
-              <w:t>5</w:t>
+              <w:t>6</w:t>
             </w:r>
             <w:r>
               <w:rPr>
@@ -297,15 +334,77 @@
           <w:pPr>
             <w:pStyle w:val="TOC1"/>
             <w:rPr>
-              <w:rFonts w:eastAsiaTheme="minorEastAsia"/>
+              <w:rFonts w:asciiTheme="minorHAnsi" w:eastAsiaTheme="minorEastAsia" w:hAnsiTheme="minorHAnsi" w:cstheme="minorBidi"/>
+              <w:b w:val="0"/>
+              <w:bCs w:val="0"/>
             </w:rPr>
           </w:pPr>
-          <w:hyperlink w:anchor="_Toc201602565" w:history="1">
+          <w:hyperlink w:anchor="_Toc203579030" w:history="1">
             <w:r>
               <w:rPr>
                 <w:rStyle w:val="Hyperlink"/>
                 <w:rFonts w:eastAsia="Times New Roman"/>
               </w:rPr>
+              <w:t>Alternative Export Methods (e.g., for Adobe Animate)</w:t>
+            </w:r>
+            <w:r>
+              <w:rPr>
+                <w:webHidden/>
+              </w:rPr>
+              <w:tab/>
+            </w:r>
+            <w:r>
+              <w:rPr>
+                <w:webHidden/>
+              </w:rPr>
+              <w:fldChar w:fldCharType="begin"/>
+            </w:r>
+            <w:r>
+              <w:rPr>
+                <w:webHidden/>
+              </w:rPr>
+              <w:instrText xml:space="preserve"> PAGEREF _Toc203579030 \h </w:instrText>
+            </w:r>
+            <w:r>
+              <w:rPr>
+                <w:webHidden/>
+              </w:rPr>
+            </w:r>
+            <w:r>
+              <w:rPr>
+                <w:webHidden/>
+              </w:rPr>
+              <w:fldChar w:fldCharType="separate"/>
+            </w:r>
+            <w:r>
+              <w:rPr>
+                <w:webHidden/>
+              </w:rPr>
+              <w:t>7</w:t>
+            </w:r>
+            <w:r>
+              <w:rPr>
+                <w:webHidden/>
+              </w:rPr>
+              <w:fldChar w:fldCharType="end"/>
+            </w:r>
+          </w:hyperlink>
+        </w:p>
+        <w:p>
+          <w:pPr>
+            <w:pStyle w:val="TOC1"/>
+            <w:rPr>
+              <w:rFonts w:asciiTheme="minorHAnsi" w:eastAsiaTheme="minorEastAsia" w:hAnsiTheme="minorHAnsi" w:cstheme="minorBidi"/>
+              <w:b w:val="0"/>
+              <w:bCs w:val="0"/>
+            </w:rPr>
+          </w:pPr>
+          <w:hyperlink w:anchor="_Toc203579031" w:history="1">
+            <w:r>
+              <w:rPr>
+                <w:rStyle w:val="Hyperlink"/>
+                <w:rFonts w:eastAsia="Times New Roman"/>
+              </w:rPr>
               <w:t>Adobe Animate resource preparation</w:t>
             </w:r>
             <w:r>
@@ -324,7 +423,7 @@
               <w:rPr>
                 <w:webHidden/>
               </w:rPr>
-              <w:instrText xml:space="preserve"> PAGEREF _Toc201602565 \h </w:instrText>
+              <w:instrText xml:space="preserve"> PAGEREF _Toc203579031 \h </w:instrText>
             </w:r>
             <w:r>
               <w:rPr>
@@ -341,7 +440,7 @@
               <w:rPr>
                 <w:webHidden/>
               </w:rPr>
-              <w:t>7</w:t>
+              <w:t>8</w:t>
             </w:r>
             <w:r>
               <w:rPr>
@@ -355,10 +454,12 @@
           <w:pPr>
             <w:pStyle w:val="TOC2"/>
             <w:rPr>
-              <w:rFonts w:eastAsiaTheme="minorEastAsia"/>
+              <w:rFonts w:asciiTheme="minorHAnsi" w:eastAsiaTheme="minorEastAsia" w:hAnsiTheme="minorHAnsi" w:cstheme="minorBidi"/>
+              <w:i w:val="0"/>
+              <w:iCs w:val="0"/>
             </w:rPr>
           </w:pPr>
-          <w:hyperlink w:anchor="_Toc201602566" w:history="1">
+          <w:hyperlink w:anchor="_Toc203579032" w:history="1">
             <w:r>
               <w:rPr>
                 <w:rStyle w:val="Hyperlink"/>
@@ -381,7 +482,7 @@
               <w:rPr>
                 <w:webHidden/>
               </w:rPr>
-              <w:instrText xml:space="preserve"> PAGEREF _Toc201602566 \h </w:instrText>
+              <w:instrText xml:space="preserve"> PAGEREF _Toc203579032 \h </w:instrText>
             </w:r>
             <w:r>
               <w:rPr>
@@ -398,7 +499,7 @@
               <w:rPr>
                 <w:webHidden/>
               </w:rPr>
-              <w:t>7</w:t>
+              <w:t>8</w:t>
             </w:r>
             <w:r>
               <w:rPr>
@@ -412,10 +513,12 @@
           <w:pPr>
             <w:pStyle w:val="TOC2"/>
             <w:rPr>
-              <w:rFonts w:eastAsiaTheme="minorEastAsia"/>
+              <w:rFonts w:asciiTheme="minorHAnsi" w:eastAsiaTheme="minorEastAsia" w:hAnsiTheme="minorHAnsi" w:cstheme="minorBidi"/>
+              <w:i w:val="0"/>
+              <w:iCs w:val="0"/>
             </w:rPr>
           </w:pPr>
-          <w:hyperlink w:anchor="_Toc201602567" w:history="1">
+          <w:hyperlink w:anchor="_Toc203579033" w:history="1">
             <w:r>
               <w:rPr>
                 <w:rStyle w:val="Hyperlink"/>
@@ -438,7 +541,7 @@
               <w:rPr>
                 <w:webHidden/>
               </w:rPr>
-              <w:instrText xml:space="preserve"> PAGEREF _Toc201602567 \h </w:instrText>
+              <w:instrText xml:space="preserve"> PAGEREF _Toc203579033 \h </w:instrText>
             </w:r>
             <w:r>
               <w:rPr>
@@ -455,7 +558,7 @@
               <w:rPr>
                 <w:webHidden/>
               </w:rPr>
-              <w:t>8</w:t>
+              <w:t>9</w:t>
             </w:r>
             <w:r>
               <w:rPr>
@@ -469,10 +572,12 @@
           <w:pPr>
             <w:pStyle w:val="TOC1"/>
             <w:rPr>
-              <w:rFonts w:eastAsiaTheme="minorEastAsia"/>
+              <w:rFonts w:asciiTheme="minorHAnsi" w:eastAsiaTheme="minorEastAsia" w:hAnsiTheme="minorHAnsi" w:cstheme="minorBidi"/>
+              <w:b w:val="0"/>
+              <w:bCs w:val="0"/>
             </w:rPr>
           </w:pPr>
-          <w:hyperlink w:anchor="_Toc201602568" w:history="1">
+          <w:hyperlink w:anchor="_Toc203579034" w:history="1">
             <w:r>
               <w:rPr>
                 <w:rStyle w:val="Hyperlink"/>
@@ -495,7 +600,7 @@
               <w:rPr>
                 <w:webHidden/>
               </w:rPr>
-              <w:instrText xml:space="preserve"> PAGEREF _Toc201602568 \h </w:instrText>
+              <w:instrText xml:space="preserve"> PAGEREF _Toc203579034 \h </w:instrText>
             </w:r>
             <w:r>
               <w:rPr>
@@ -512,7 +617,7 @@
               <w:rPr>
                 <w:webHidden/>
               </w:rPr>
-              <w:t>9</w:t>
+              <w:t>10</w:t>
             </w:r>
             <w:r>
               <w:rPr>
@@ -526,15 +631,17 @@
           <w:pPr>
             <w:pStyle w:val="TOC2"/>
             <w:rPr>
-              <w:rFonts w:eastAsiaTheme="minorEastAsia"/>
+              <w:rFonts w:asciiTheme="minorHAnsi" w:eastAsiaTheme="minorEastAsia" w:hAnsiTheme="minorHAnsi" w:cstheme="minorBidi"/>
+              <w:i w:val="0"/>
+              <w:iCs w:val="0"/>
             </w:rPr>
           </w:pPr>
-          <w:hyperlink w:anchor="_Toc201602569" w:history="1">
+          <w:hyperlink w:anchor="_Toc203579035" w:history="1">
             <w:r>
               <w:rPr>
                 <w:rStyle w:val="Hyperlink"/>
               </w:rPr>
-              <w:t>Importing from Photoshop (via Script)</w:t>
+              <w:t>Importing from Photoshop (via Script before)</w:t>
             </w:r>
             <w:r>
               <w:rPr>
@@ -552,7 +659,7 @@
               <w:rPr>
                 <w:webHidden/>
               </w:rPr>
-              <w:instrText xml:space="preserve"> PAGEREF _Toc201602569 \h </w:instrText>
+              <w:instrText xml:space="preserve"> PAGEREF _Toc203579035 \h </w:instrText>
             </w:r>
             <w:r>
               <w:rPr>
@@ -569,7 +676,7 @@
               <w:rPr>
                 <w:webHidden/>
               </w:rPr>
-              <w:t>9</w:t>
+              <w:t>10</w:t>
             </w:r>
             <w:r>
               <w:rPr>
@@ -583,10 +690,12 @@
           <w:pPr>
             <w:pStyle w:val="TOC2"/>
             <w:rPr>
-              <w:rFonts w:eastAsiaTheme="minorEastAsia"/>
+              <w:rFonts w:asciiTheme="minorHAnsi" w:eastAsiaTheme="minorEastAsia" w:hAnsiTheme="minorHAnsi" w:cstheme="minorBidi"/>
+              <w:i w:val="0"/>
+              <w:iCs w:val="0"/>
             </w:rPr>
           </w:pPr>
-          <w:hyperlink w:anchor="_Toc201602570" w:history="1">
+          <w:hyperlink w:anchor="_Toc203579036" w:history="1">
             <w:r>
               <w:rPr>
                 <w:rStyle w:val="Hyperlink"/>
@@ -609,7 +718,7 @@
               <w:rPr>
                 <w:webHidden/>
               </w:rPr>
-              <w:instrText xml:space="preserve"> PAGEREF _Toc201602570 \h </w:instrText>
+              <w:instrText xml:space="preserve"> PAGEREF _Toc203579036 \h </w:instrText>
             </w:r>
             <w:r>
               <w:rPr>
@@ -626,7 +735,7 @@
               <w:rPr>
                 <w:webHidden/>
               </w:rPr>
-              <w:t>9</w:t>
+              <w:t>10</w:t>
             </w:r>
             <w:r>
               <w:rPr>
@@ -640,10 +749,12 @@
           <w:pPr>
             <w:pStyle w:val="TOC2"/>
             <w:rPr>
-              <w:rFonts w:eastAsiaTheme="minorEastAsia"/>
+              <w:rFonts w:asciiTheme="minorHAnsi" w:eastAsiaTheme="minorEastAsia" w:hAnsiTheme="minorHAnsi" w:cstheme="minorBidi"/>
+              <w:i w:val="0"/>
+              <w:iCs w:val="0"/>
             </w:rPr>
           </w:pPr>
-          <w:hyperlink w:anchor="_Toc201602571" w:history="1">
+          <w:hyperlink w:anchor="_Toc203579037" w:history="1">
             <w:r>
               <w:rPr>
                 <w:rStyle w:val="Hyperlink"/>
@@ -666,7 +777,7 @@
               <w:rPr>
                 <w:webHidden/>
               </w:rPr>
-              <w:instrText xml:space="preserve"> PAGEREF _Toc201602571 \h </w:instrText>
+              <w:instrText xml:space="preserve"> PAGEREF _Toc203579037 \h </w:instrText>
             </w:r>
             <w:r>
               <w:rPr>
@@ -683,7 +794,7 @@
               <w:rPr>
                 <w:webHidden/>
               </w:rPr>
-              <w:t>10</w:t>
+              <w:t>11</w:t>
             </w:r>
             <w:r>
               <w:rPr>
@@ -697,10 +808,12 @@
           <w:pPr>
             <w:pStyle w:val="TOC2"/>
             <w:rPr>
-              <w:rFonts w:eastAsiaTheme="minorEastAsia"/>
+              <w:rFonts w:asciiTheme="minorHAnsi" w:eastAsiaTheme="minorEastAsia" w:hAnsiTheme="minorHAnsi" w:cstheme="minorBidi"/>
+              <w:i w:val="0"/>
+              <w:iCs w:val="0"/>
             </w:rPr>
           </w:pPr>
-          <w:hyperlink w:anchor="_Toc201602572" w:history="1">
+          <w:hyperlink w:anchor="_Toc203579038" w:history="1">
             <w:r>
               <w:rPr>
                 <w:rStyle w:val="Hyperlink"/>
@@ -723,7 +836,7 @@
               <w:rPr>
                 <w:webHidden/>
               </w:rPr>
-              <w:instrText xml:space="preserve"> PAGEREF _Toc201602572 \h </w:instrText>
+              <w:instrText xml:space="preserve"> PAGEREF _Toc203579038 \h </w:instrText>
             </w:r>
             <w:r>
               <w:rPr>
@@ -740,7 +853,7 @@
               <w:rPr>
                 <w:webHidden/>
               </w:rPr>
-              <w:t>11</w:t>
+              <w:t>12</w:t>
             </w:r>
             <w:r>
               <w:rPr>
@@ -754,10 +867,12 @@
           <w:pPr>
             <w:pStyle w:val="TOC2"/>
             <w:rPr>
-              <w:rFonts w:eastAsiaTheme="minorEastAsia"/>
+              <w:rFonts w:asciiTheme="minorHAnsi" w:eastAsiaTheme="minorEastAsia" w:hAnsiTheme="minorHAnsi" w:cstheme="minorBidi"/>
+              <w:i w:val="0"/>
+              <w:iCs w:val="0"/>
             </w:rPr>
           </w:pPr>
-          <w:hyperlink w:anchor="_Toc201602573" w:history="1">
+          <w:hyperlink w:anchor="_Toc203579039" w:history="1">
             <w:r>
               <w:rPr>
                 <w:rStyle w:val="Hyperlink"/>
@@ -780,7 +895,7 @@
               <w:rPr>
                 <w:webHidden/>
               </w:rPr>
-              <w:instrText xml:space="preserve"> PAGEREF _Toc201602573 \h </w:instrText>
+              <w:instrText xml:space="preserve"> PAGEREF _Toc203579039 \h </w:instrText>
             </w:r>
             <w:r>
               <w:rPr>
@@ -797,7 +912,7 @@
               <w:rPr>
                 <w:webHidden/>
               </w:rPr>
-              <w:t>11</w:t>
+              <w:t>12</w:t>
             </w:r>
             <w:r>
               <w:rPr>
@@ -811,10 +926,12 @@
           <w:pPr>
             <w:pStyle w:val="TOC2"/>
             <w:rPr>
-              <w:rFonts w:eastAsiaTheme="minorEastAsia"/>
+              <w:rFonts w:asciiTheme="minorHAnsi" w:eastAsiaTheme="minorEastAsia" w:hAnsiTheme="minorHAnsi" w:cstheme="minorBidi"/>
+              <w:i w:val="0"/>
+              <w:iCs w:val="0"/>
             </w:rPr>
           </w:pPr>
-          <w:hyperlink w:anchor="_Toc201602574" w:history="1">
+          <w:hyperlink w:anchor="_Toc203579040" w:history="1">
             <w:r>
               <w:rPr>
                 <w:rStyle w:val="Hyperlink"/>
@@ -837,7 +954,7 @@
               <w:rPr>
                 <w:webHidden/>
               </w:rPr>
-              <w:instrText xml:space="preserve"> PAGEREF _Toc201602574 \h </w:instrText>
+              <w:instrText xml:space="preserve"> PAGEREF _Toc203579040 \h </w:instrText>
             </w:r>
             <w:r>
               <w:rPr>
@@ -854,7 +971,7 @@
               <w:rPr>
                 <w:webHidden/>
               </w:rPr>
-              <w:t>11</w:t>
+              <w:t>12</w:t>
             </w:r>
             <w:r>
               <w:rPr>
@@ -868,10 +985,12 @@
           <w:pPr>
             <w:pStyle w:val="TOC2"/>
             <w:rPr>
-              <w:rFonts w:eastAsiaTheme="minorEastAsia"/>
+              <w:rFonts w:asciiTheme="minorHAnsi" w:eastAsiaTheme="minorEastAsia" w:hAnsiTheme="minorHAnsi" w:cstheme="minorBidi"/>
+              <w:i w:val="0"/>
+              <w:iCs w:val="0"/>
             </w:rPr>
           </w:pPr>
-          <w:hyperlink w:anchor="_Toc201602575" w:history="1">
+          <w:hyperlink w:anchor="_Toc203579041" w:history="1">
             <w:r>
               <w:rPr>
                 <w:rStyle w:val="Hyperlink"/>
@@ -894,7 +1013,7 @@
               <w:rPr>
                 <w:webHidden/>
               </w:rPr>
-              <w:instrText xml:space="preserve"> PAGEREF _Toc201602575 \h </w:instrText>
+              <w:instrText xml:space="preserve"> PAGEREF _Toc203579041 \h </w:instrText>
             </w:r>
             <w:r>
               <w:rPr>
@@ -911,7 +1030,7 @@
               <w:rPr>
                 <w:webHidden/>
               </w:rPr>
-              <w:t>12</w:t>
+              <w:t>13</w:t>
             </w:r>
             <w:r>
               <w:rPr>
@@ -925,10 +1044,12 @@
           <w:pPr>
             <w:pStyle w:val="TOC2"/>
             <w:rPr>
-              <w:rFonts w:eastAsiaTheme="minorEastAsia"/>
+              <w:rFonts w:asciiTheme="minorHAnsi" w:eastAsiaTheme="minorEastAsia" w:hAnsiTheme="minorHAnsi" w:cstheme="minorBidi"/>
+              <w:i w:val="0"/>
+              <w:iCs w:val="0"/>
             </w:rPr>
           </w:pPr>
-          <w:hyperlink w:anchor="_Toc201602576" w:history="1">
+          <w:hyperlink w:anchor="_Toc203579042" w:history="1">
             <w:r>
               <w:rPr>
                 <w:rStyle w:val="Hyperlink"/>
@@ -951,7 +1072,7 @@
               <w:rPr>
                 <w:webHidden/>
               </w:rPr>
-              <w:instrText xml:space="preserve"> PAGEREF _Toc201602576 \h </w:instrText>
+              <w:instrText xml:space="preserve"> PAGEREF _Toc203579042 \h </w:instrText>
             </w:r>
             <w:r>
               <w:rPr>
@@ -968,7 +1089,7 @@
               <w:rPr>
                 <w:webHidden/>
               </w:rPr>
-              <w:t>13</w:t>
+              <w:t>14</w:t>
             </w:r>
             <w:r>
               <w:rPr>
@@ -985,22 +1106,21 @@
               <w:tab w:val="right" w:leader="dot" w:pos="9350"/>
             </w:tabs>
             <w:rPr>
-              <w:rFonts w:ascii="Calibri" w:eastAsiaTheme="minorEastAsia" w:hAnsi="Calibri" w:cs="Calibri"/>
+              <w:rFonts w:eastAsiaTheme="minorEastAsia"/>
               <w:noProof/>
             </w:rPr>
           </w:pPr>
-          <w:hyperlink w:anchor="_Toc201602577" w:history="1">
+          <w:hyperlink w:anchor="_Toc203579043" w:history="1">
             <w:r>
               <w:rPr>
                 <w:rStyle w:val="Hyperlink"/>
-                <w:rFonts w:ascii="Calibri" w:hAnsi="Calibri" w:cs="Calibri"/>
+                <w:rFonts w:cs="Calibri"/>
                 <w:noProof/>
               </w:rPr>
               <w:t>Data:</w:t>
             </w:r>
             <w:r>
               <w:rPr>
-                <w:rFonts w:ascii="Calibri" w:hAnsi="Calibri" w:cs="Calibri"/>
                 <w:noProof/>
                 <w:webHidden/>
               </w:rPr>
@@ -1008,7 +1128,6 @@
             </w:r>
             <w:r>
               <w:rPr>
-                <w:rFonts w:ascii="Calibri" w:hAnsi="Calibri" w:cs="Calibri"/>
                 <w:noProof/>
                 <w:webHidden/>
               </w:rPr>
@@ -1016,22 +1135,19 @@
             </w:r>
             <w:r>
               <w:rPr>
-                <w:rFonts w:ascii="Calibri" w:hAnsi="Calibri" w:cs="Calibri"/>
                 <w:noProof/>
                 <w:webHidden/>
               </w:rPr>
-              <w:instrText xml:space="preserve"> PAGEREF _Toc201602577 \h </w:instrText>
-            </w:r>
-            <w:r>
-              <w:rPr>
-                <w:rFonts w:ascii="Calibri" w:hAnsi="Calibri" w:cs="Calibri"/>
+              <w:instrText xml:space="preserve"> PAGEREF _Toc203579043 \h </w:instrText>
+            </w:r>
+            <w:r>
+              <w:rPr>
                 <w:noProof/>
                 <w:webHidden/>
               </w:rPr>
             </w:r>
             <w:r>
               <w:rPr>
-                <w:rFonts w:ascii="Calibri" w:hAnsi="Calibri" w:cs="Calibri"/>
                 <w:noProof/>
                 <w:webHidden/>
               </w:rPr>
@@ -1039,15 +1155,13 @@
             </w:r>
             <w:r>
               <w:rPr>
-                <w:rFonts w:ascii="Calibri" w:hAnsi="Calibri" w:cs="Calibri"/>
                 <w:noProof/>
                 <w:webHidden/>
               </w:rPr>
-              <w:t>13</w:t>
-            </w:r>
-            <w:r>
-              <w:rPr>
-                <w:rFonts w:ascii="Calibri" w:hAnsi="Calibri" w:cs="Calibri"/>
+              <w:t>14</w:t>
+            </w:r>
+            <w:r>
+              <w:rPr>
                 <w:noProof/>
                 <w:webHidden/>
               </w:rPr>
@@ -1062,22 +1176,21 @@
               <w:tab w:val="right" w:leader="dot" w:pos="9350"/>
             </w:tabs>
             <w:rPr>
-              <w:rFonts w:ascii="Calibri" w:eastAsiaTheme="minorEastAsia" w:hAnsi="Calibri" w:cs="Calibri"/>
+              <w:rFonts w:eastAsiaTheme="minorEastAsia"/>
               <w:noProof/>
             </w:rPr>
           </w:pPr>
-          <w:hyperlink w:anchor="_Toc201602578" w:history="1">
+          <w:hyperlink w:anchor="_Toc203579044" w:history="1">
             <w:r>
               <w:rPr>
                 <w:rStyle w:val="Hyperlink"/>
-                <w:rFonts w:ascii="Calibri" w:hAnsi="Calibri" w:cs="Calibri"/>
+                <w:rFonts w:cs="Calibri"/>
                 <w:noProof/>
               </w:rPr>
               <w:t>Image or Video:</w:t>
             </w:r>
             <w:r>
               <w:rPr>
-                <w:rFonts w:ascii="Calibri" w:hAnsi="Calibri" w:cs="Calibri"/>
                 <w:noProof/>
                 <w:webHidden/>
               </w:rPr>
@@ -1085,7 +1198,6 @@
             </w:r>
             <w:r>
               <w:rPr>
-                <w:rFonts w:ascii="Calibri" w:hAnsi="Calibri" w:cs="Calibri"/>
                 <w:noProof/>
                 <w:webHidden/>
               </w:rPr>
@@ -1093,22 +1205,19 @@
             </w:r>
             <w:r>
               <w:rPr>
-                <w:rFonts w:ascii="Calibri" w:hAnsi="Calibri" w:cs="Calibri"/>
                 <w:noProof/>
                 <w:webHidden/>
               </w:rPr>
-              <w:instrText xml:space="preserve"> PAGEREF _Toc201602578 \h </w:instrText>
-            </w:r>
-            <w:r>
-              <w:rPr>
-                <w:rFonts w:ascii="Calibri" w:hAnsi="Calibri" w:cs="Calibri"/>
+              <w:instrText xml:space="preserve"> PAGEREF _Toc203579044 \h </w:instrText>
+            </w:r>
+            <w:r>
+              <w:rPr>
                 <w:noProof/>
                 <w:webHidden/>
               </w:rPr>
             </w:r>
             <w:r>
               <w:rPr>
-                <w:rFonts w:ascii="Calibri" w:hAnsi="Calibri" w:cs="Calibri"/>
                 <w:noProof/>
                 <w:webHidden/>
               </w:rPr>
@@ -1116,15 +1225,13 @@
             </w:r>
             <w:r>
               <w:rPr>
-                <w:rFonts w:ascii="Calibri" w:hAnsi="Calibri" w:cs="Calibri"/>
                 <w:noProof/>
                 <w:webHidden/>
               </w:rPr>
-              <w:t>13</w:t>
-            </w:r>
-            <w:r>
-              <w:rPr>
-                <w:rFonts w:ascii="Calibri" w:hAnsi="Calibri" w:cs="Calibri"/>
+              <w:t>14</w:t>
+            </w:r>
+            <w:r>
+              <w:rPr>
                 <w:noProof/>
                 <w:webHidden/>
               </w:rPr>
@@ -1136,10 +1243,12 @@
           <w:pPr>
             <w:pStyle w:val="TOC1"/>
             <w:rPr>
-              <w:rFonts w:eastAsiaTheme="minorEastAsia"/>
+              <w:rFonts w:asciiTheme="minorHAnsi" w:eastAsiaTheme="minorEastAsia" w:hAnsiTheme="minorHAnsi" w:cstheme="minorBidi"/>
+              <w:b w:val="0"/>
+              <w:bCs w:val="0"/>
             </w:rPr>
           </w:pPr>
-          <w:hyperlink w:anchor="_Toc201602579" w:history="1">
+          <w:hyperlink w:anchor="_Toc203579045" w:history="1">
             <w:r>
               <w:rPr>
                 <w:rStyle w:val="Hyperlink"/>
@@ -1162,7 +1271,7 @@
               <w:rPr>
                 <w:webHidden/>
               </w:rPr>
-              <w:instrText xml:space="preserve"> PAGEREF _Toc201602579 \h </w:instrText>
+              <w:instrText xml:space="preserve"> PAGEREF _Toc203579045 \h </w:instrText>
             </w:r>
             <w:r>
               <w:rPr>
@@ -1179,7 +1288,7 @@
               <w:rPr>
                 <w:webHidden/>
               </w:rPr>
-              <w:t>14</w:t>
+              <w:t>15</w:t>
             </w:r>
             <w:r>
               <w:rPr>
@@ -1193,10 +1302,12 @@
           <w:pPr>
             <w:pStyle w:val="TOC2"/>
             <w:rPr>
-              <w:rFonts w:eastAsiaTheme="minorEastAsia"/>
+              <w:rFonts w:asciiTheme="minorHAnsi" w:eastAsiaTheme="minorEastAsia" w:hAnsiTheme="minorHAnsi" w:cstheme="minorBidi"/>
+              <w:i w:val="0"/>
+              <w:iCs w:val="0"/>
             </w:rPr>
           </w:pPr>
-          <w:hyperlink w:anchor="_Toc201602580" w:history="1">
+          <w:hyperlink w:anchor="_Toc203579046" w:history="1">
             <w:r>
               <w:rPr>
                 <w:rStyle w:val="Hyperlink"/>
@@ -1219,7 +1330,7 @@
               <w:rPr>
                 <w:webHidden/>
               </w:rPr>
-              <w:instrText xml:space="preserve"> PAGEREF _Toc201602580 \h </w:instrText>
+              <w:instrText xml:space="preserve"> PAGEREF _Toc203579046 \h </w:instrText>
             </w:r>
             <w:r>
               <w:rPr>
@@ -1236,7 +1347,7 @@
               <w:rPr>
                 <w:webHidden/>
               </w:rPr>
-              <w:t>14</w:t>
+              <w:t>15</w:t>
             </w:r>
             <w:r>
               <w:rPr>
@@ -1250,10 +1361,12 @@
           <w:pPr>
             <w:pStyle w:val="TOC2"/>
             <w:rPr>
-              <w:rFonts w:eastAsiaTheme="minorEastAsia"/>
+              <w:rFonts w:asciiTheme="minorHAnsi" w:eastAsiaTheme="minorEastAsia" w:hAnsiTheme="minorHAnsi" w:cstheme="minorBidi"/>
+              <w:i w:val="0"/>
+              <w:iCs w:val="0"/>
             </w:rPr>
           </w:pPr>
-          <w:hyperlink w:anchor="_Toc201602581" w:history="1">
+          <w:hyperlink w:anchor="_Toc203579047" w:history="1">
             <w:r>
               <w:rPr>
                 <w:rStyle w:val="Hyperlink"/>
@@ -1276,7 +1389,7 @@
               <w:rPr>
                 <w:webHidden/>
               </w:rPr>
-              <w:instrText xml:space="preserve"> PAGEREF _Toc201602581 \h </w:instrText>
+              <w:instrText xml:space="preserve"> PAGEREF _Toc203579047 \h </w:instrText>
             </w:r>
             <w:r>
               <w:rPr>
@@ -1293,7 +1406,7 @@
               <w:rPr>
                 <w:webHidden/>
               </w:rPr>
-              <w:t>14</w:t>
+              <w:t>15</w:t>
             </w:r>
             <w:r>
               <w:rPr>
@@ -1307,10 +1420,12 @@
           <w:pPr>
             <w:pStyle w:val="TOC2"/>
             <w:rPr>
-              <w:rFonts w:eastAsiaTheme="minorEastAsia"/>
+              <w:rFonts w:asciiTheme="minorHAnsi" w:eastAsiaTheme="minorEastAsia" w:hAnsiTheme="minorHAnsi" w:cstheme="minorBidi"/>
+              <w:i w:val="0"/>
+              <w:iCs w:val="0"/>
             </w:rPr>
           </w:pPr>
-          <w:hyperlink w:anchor="_Toc201602582" w:history="1">
+          <w:hyperlink w:anchor="_Toc203579048" w:history="1">
             <w:r>
               <w:rPr>
                 <w:rStyle w:val="Hyperlink"/>
@@ -1333,7 +1448,7 @@
               <w:rPr>
                 <w:webHidden/>
               </w:rPr>
-              <w:instrText xml:space="preserve"> PAGEREF _Toc201602582 \h </w:instrText>
+              <w:instrText xml:space="preserve"> PAGEREF _Toc203579048 \h </w:instrText>
             </w:r>
             <w:r>
               <w:rPr>
@@ -1350,7 +1465,7 @@
               <w:rPr>
                 <w:webHidden/>
               </w:rPr>
-              <w:t>16</w:t>
+              <w:t>17</w:t>
             </w:r>
             <w:r>
               <w:rPr>
@@ -1367,22 +1482,21 @@
               <w:tab w:val="right" w:leader="dot" w:pos="9350"/>
             </w:tabs>
             <w:rPr>
-              <w:rFonts w:ascii="Calibri" w:eastAsiaTheme="minorEastAsia" w:hAnsi="Calibri" w:cs="Calibri"/>
+              <w:rFonts w:eastAsiaTheme="minorEastAsia"/>
               <w:noProof/>
             </w:rPr>
           </w:pPr>
-          <w:hyperlink w:anchor="_Toc201602583" w:history="1">
+          <w:hyperlink w:anchor="_Toc203579049" w:history="1">
             <w:r>
               <w:rPr>
                 <w:rStyle w:val="Hyperlink"/>
-                <w:rFonts w:ascii="Calibri" w:hAnsi="Calibri" w:cs="Calibri"/>
+                <w:rFonts w:cs="Calibri"/>
                 <w:noProof/>
               </w:rPr>
               <w:t>Output files</w:t>
             </w:r>
             <w:r>
               <w:rPr>
-                <w:rFonts w:ascii="Calibri" w:hAnsi="Calibri" w:cs="Calibri"/>
                 <w:noProof/>
                 <w:webHidden/>
               </w:rPr>
@@ -1390,7 +1504,6 @@
             </w:r>
             <w:r>
               <w:rPr>
-                <w:rFonts w:ascii="Calibri" w:hAnsi="Calibri" w:cs="Calibri"/>
                 <w:noProof/>
                 <w:webHidden/>
               </w:rPr>
@@ -1398,22 +1511,19 @@
             </w:r>
             <w:r>
               <w:rPr>
-                <w:rFonts w:ascii="Calibri" w:hAnsi="Calibri" w:cs="Calibri"/>
                 <w:noProof/>
                 <w:webHidden/>
               </w:rPr>
-              <w:instrText xml:space="preserve"> PAGEREF _Toc201602583 \h </w:instrText>
-            </w:r>
-            <w:r>
-              <w:rPr>
-                <w:rFonts w:ascii="Calibri" w:hAnsi="Calibri" w:cs="Calibri"/>
+              <w:instrText xml:space="preserve"> PAGEREF _Toc203579049 \h </w:instrText>
+            </w:r>
+            <w:r>
+              <w:rPr>
                 <w:noProof/>
                 <w:webHidden/>
               </w:rPr>
             </w:r>
             <w:r>
               <w:rPr>
-                <w:rFonts w:ascii="Calibri" w:hAnsi="Calibri" w:cs="Calibri"/>
                 <w:noProof/>
                 <w:webHidden/>
               </w:rPr>
@@ -1421,15 +1531,13 @@
             </w:r>
             <w:r>
               <w:rPr>
-                <w:rFonts w:ascii="Calibri" w:hAnsi="Calibri" w:cs="Calibri"/>
                 <w:noProof/>
                 <w:webHidden/>
               </w:rPr>
-              <w:t>17</w:t>
-            </w:r>
-            <w:r>
-              <w:rPr>
-                <w:rFonts w:ascii="Calibri" w:hAnsi="Calibri" w:cs="Calibri"/>
+              <w:t>18</w:t>
+            </w:r>
+            <w:r>
+              <w:rPr>
                 <w:noProof/>
                 <w:webHidden/>
               </w:rPr>
@@ -1444,22 +1552,21 @@
               <w:tab w:val="right" w:leader="dot" w:pos="9350"/>
             </w:tabs>
             <w:rPr>
-              <w:rFonts w:ascii="Calibri" w:eastAsiaTheme="minorEastAsia" w:hAnsi="Calibri" w:cs="Calibri"/>
+              <w:rFonts w:eastAsiaTheme="minorEastAsia"/>
               <w:noProof/>
             </w:rPr>
           </w:pPr>
-          <w:hyperlink w:anchor="_Toc201602584" w:history="1">
+          <w:hyperlink w:anchor="_Toc203579050" w:history="1">
             <w:r>
               <w:rPr>
                 <w:rStyle w:val="Hyperlink"/>
-                <w:rFonts w:ascii="Calibri" w:hAnsi="Calibri" w:cs="Calibri"/>
+                <w:rFonts w:cs="Calibri"/>
                 <w:noProof/>
               </w:rPr>
               <w:t>Image format</w:t>
             </w:r>
             <w:r>
               <w:rPr>
-                <w:rFonts w:ascii="Calibri" w:hAnsi="Calibri" w:cs="Calibri"/>
                 <w:noProof/>
                 <w:webHidden/>
               </w:rPr>
@@ -1467,7 +1574,6 @@
             </w:r>
             <w:r>
               <w:rPr>
-                <w:rFonts w:ascii="Calibri" w:hAnsi="Calibri" w:cs="Calibri"/>
                 <w:noProof/>
                 <w:webHidden/>
               </w:rPr>
@@ -1475,22 +1581,19 @@
             </w:r>
             <w:r>
               <w:rPr>
-                <w:rFonts w:ascii="Calibri" w:hAnsi="Calibri" w:cs="Calibri"/>
                 <w:noProof/>
                 <w:webHidden/>
               </w:rPr>
-              <w:instrText xml:space="preserve"> PAGEREF _Toc201602584 \h </w:instrText>
-            </w:r>
-            <w:r>
-              <w:rPr>
-                <w:rFonts w:ascii="Calibri" w:hAnsi="Calibri" w:cs="Calibri"/>
+              <w:instrText xml:space="preserve"> PAGEREF _Toc203579050 \h </w:instrText>
+            </w:r>
+            <w:r>
+              <w:rPr>
                 <w:noProof/>
                 <w:webHidden/>
               </w:rPr>
             </w:r>
             <w:r>
               <w:rPr>
-                <w:rFonts w:ascii="Calibri" w:hAnsi="Calibri" w:cs="Calibri"/>
                 <w:noProof/>
                 <w:webHidden/>
               </w:rPr>
@@ -1498,15 +1601,13 @@
             </w:r>
             <w:r>
               <w:rPr>
-                <w:rFonts w:ascii="Calibri" w:hAnsi="Calibri" w:cs="Calibri"/>
                 <w:noProof/>
                 <w:webHidden/>
               </w:rPr>
-              <w:t>17</w:t>
-            </w:r>
-            <w:r>
-              <w:rPr>
-                <w:rFonts w:ascii="Calibri" w:hAnsi="Calibri" w:cs="Calibri"/>
+              <w:t>18</w:t>
+            </w:r>
+            <w:r>
+              <w:rPr>
                 <w:noProof/>
                 <w:webHidden/>
               </w:rPr>
@@ -1521,22 +1622,21 @@
               <w:tab w:val="right" w:leader="dot" w:pos="9350"/>
             </w:tabs>
             <w:rPr>
-              <w:rFonts w:ascii="Calibri" w:eastAsiaTheme="minorEastAsia" w:hAnsi="Calibri" w:cs="Calibri"/>
+              <w:rFonts w:eastAsiaTheme="minorEastAsia"/>
               <w:noProof/>
             </w:rPr>
           </w:pPr>
-          <w:hyperlink w:anchor="_Toc201602585" w:history="1">
+          <w:hyperlink w:anchor="_Toc203579051" w:history="1">
             <w:r>
               <w:rPr>
                 <w:rStyle w:val="Hyperlink"/>
-                <w:rFonts w:ascii="Calibri" w:hAnsi="Calibri" w:cs="Calibri"/>
+                <w:rFonts w:cs="Calibri"/>
                 <w:noProof/>
               </w:rPr>
               <w:t>Packing</w:t>
             </w:r>
             <w:r>
               <w:rPr>
-                <w:rFonts w:ascii="Calibri" w:hAnsi="Calibri" w:cs="Calibri"/>
                 <w:noProof/>
                 <w:webHidden/>
               </w:rPr>
@@ -1544,7 +1644,6 @@
             </w:r>
             <w:r>
               <w:rPr>
-                <w:rFonts w:ascii="Calibri" w:hAnsi="Calibri" w:cs="Calibri"/>
                 <w:noProof/>
                 <w:webHidden/>
               </w:rPr>
@@ -1552,22 +1651,19 @@
             </w:r>
             <w:r>
               <w:rPr>
-                <w:rFonts w:ascii="Calibri" w:hAnsi="Calibri" w:cs="Calibri"/>
                 <w:noProof/>
                 <w:webHidden/>
               </w:rPr>
-              <w:instrText xml:space="preserve"> PAGEREF _Toc201602585 \h </w:instrText>
-            </w:r>
-            <w:r>
-              <w:rPr>
-                <w:rFonts w:ascii="Calibri" w:hAnsi="Calibri" w:cs="Calibri"/>
+              <w:instrText xml:space="preserve"> PAGEREF _Toc203579051 \h </w:instrText>
+            </w:r>
+            <w:r>
+              <w:rPr>
                 <w:noProof/>
                 <w:webHidden/>
               </w:rPr>
             </w:r>
             <w:r>
               <w:rPr>
-                <w:rFonts w:ascii="Calibri" w:hAnsi="Calibri" w:cs="Calibri"/>
                 <w:noProof/>
                 <w:webHidden/>
               </w:rPr>
@@ -1575,15 +1671,13 @@
             </w:r>
             <w:r>
               <w:rPr>
-                <w:rFonts w:ascii="Calibri" w:hAnsi="Calibri" w:cs="Calibri"/>
                 <w:noProof/>
                 <w:webHidden/>
               </w:rPr>
-              <w:t>18</w:t>
-            </w:r>
-            <w:r>
-              <w:rPr>
-                <w:rFonts w:ascii="Calibri" w:hAnsi="Calibri" w:cs="Calibri"/>
+              <w:t>19</w:t>
+            </w:r>
+            <w:r>
+              <w:rPr>
                 <w:noProof/>
                 <w:webHidden/>
               </w:rPr>
@@ -1595,10 +1689,12 @@
           <w:pPr>
             <w:pStyle w:val="TOC2"/>
             <w:rPr>
-              <w:rFonts w:eastAsiaTheme="minorEastAsia"/>
+              <w:rFonts w:asciiTheme="minorHAnsi" w:eastAsiaTheme="minorEastAsia" w:hAnsiTheme="minorHAnsi" w:cstheme="minorBidi"/>
+              <w:i w:val="0"/>
+              <w:iCs w:val="0"/>
             </w:rPr>
           </w:pPr>
-          <w:hyperlink w:anchor="_Toc201602586" w:history="1">
+          <w:hyperlink w:anchor="_Toc203579052" w:history="1">
             <w:r>
               <w:rPr>
                 <w:rStyle w:val="Hyperlink"/>
@@ -1621,7 +1717,7 @@
               <w:rPr>
                 <w:webHidden/>
               </w:rPr>
-              <w:instrText xml:space="preserve"> PAGEREF _Toc201602586 \h </w:instrText>
+              <w:instrText xml:space="preserve"> PAGEREF _Toc203579052 \h </w:instrText>
             </w:r>
             <w:r>
               <w:rPr>
@@ -1638,7 +1734,7 @@
               <w:rPr>
                 <w:webHidden/>
               </w:rPr>
-              <w:t>19</w:t>
+              <w:t>20</w:t>
             </w:r>
             <w:r>
               <w:rPr>
@@ -1668,6 +1764,8 @@
     </w:sdt>
     <w:p>
       <w:pPr>
+        <w:spacing w:after="120"/>
+        <w:jc w:val="center"/>
         <w:rPr>
           <w:rFonts w:ascii="Calibri" w:hAnsi="Calibri" w:cs="Calibri"/>
           <w:sz w:val="52"/>
@@ -1676,6 +1774,73 @@
       </w:pPr>
       <w:r>
         <w:rPr>
+          <w:noProof/>
+        </w:rPr>
+        <w:drawing>
+          <wp:anchor distT="0" distB="0" distL="114300" distR="114300" simplePos="0" relativeHeight="251670528" behindDoc="0" locked="0" layoutInCell="1" allowOverlap="1" wp14:anchorId="31F8EBBB" wp14:editId="3139AC9B">
+            <wp:simplePos x="0" y="0"/>
+            <wp:positionH relativeFrom="margin">
+              <wp:align>center</wp:align>
+            </wp:positionH>
+            <wp:positionV relativeFrom="paragraph">
+              <wp:posOffset>329111</wp:posOffset>
+            </wp:positionV>
+            <wp:extent cx="5224780" cy="4150360"/>
+            <wp:effectExtent l="0" t="0" r="0" b="2540"/>
+            <wp:wrapSquare wrapText="bothSides"/>
+            <wp:docPr id="1733195513" name="Picture 6"/>
+            <wp:cNvGraphicFramePr>
+              <a:graphicFrameLocks xmlns:a="http://schemas.openxmlformats.org/drawingml/2006/main" noChangeAspect="1"/>
+            </wp:cNvGraphicFramePr>
+            <a:graphic xmlns:a="http://schemas.openxmlformats.org/drawingml/2006/main">
+              <a:graphicData uri="http://schemas.openxmlformats.org/drawingml/2006/picture">
+                <pic:pic xmlns:pic="http://schemas.openxmlformats.org/drawingml/2006/picture">
+                  <pic:nvPicPr>
+                    <pic:cNvPr id="0" name="Picture 10"/>
+                    <pic:cNvPicPr>
+                      <a:picLocks noChangeAspect="1" noChangeArrowheads="1"/>
+                    </pic:cNvPicPr>
+                  </pic:nvPicPr>
+                  <pic:blipFill>
+                    <a:blip r:embed="rId6">
+                      <a:extLst>
+                        <a:ext uri="{28A0092B-C50C-407E-A947-70E740481C1C}">
+                          <a14:useLocalDpi xmlns:a14="http://schemas.microsoft.com/office/drawing/2010/main" val="0"/>
+                        </a:ext>
+                      </a:extLst>
+                    </a:blip>
+                    <a:srcRect/>
+                    <a:stretch>
+                      <a:fillRect/>
+                    </a:stretch>
+                  </pic:blipFill>
+                  <pic:spPr bwMode="auto">
+                    <a:xfrm>
+                      <a:off x="0" y="0"/>
+                      <a:ext cx="5224780" cy="4150360"/>
+                    </a:xfrm>
+                    <a:prstGeom prst="rect">
+                      <a:avLst/>
+                    </a:prstGeom>
+                    <a:noFill/>
+                    <a:ln>
+                      <a:noFill/>
+                    </a:ln>
+                  </pic:spPr>
+                </pic:pic>
+              </a:graphicData>
+            </a:graphic>
+            <wp14:sizeRelH relativeFrom="margin">
+              <wp14:pctWidth>0</wp14:pctWidth>
+            </wp14:sizeRelH>
+            <wp14:sizeRelV relativeFrom="margin">
+              <wp14:pctHeight>0</wp14:pctHeight>
+            </wp14:sizeRelV>
+          </wp:anchor>
+        </w:drawing>
+      </w:r>
+      <w:r>
+        <w:rPr>
           <w:rFonts w:ascii="Calibri" w:hAnsi="Calibri" w:cs="Calibri"/>
         </w:rPr>
         <w:br w:type="page"/>
@@ -1688,7 +1853,7 @@
           <w:rFonts w:cs="Calibri"/>
         </w:rPr>
       </w:pPr>
-      <w:bookmarkStart w:id="0" w:name="_Toc201602562"/>
+      <w:bookmarkStart w:id="0" w:name="_Toc203579027"/>
       <w:r>
         <w:rPr>
           <w:rFonts w:cs="Calibri"/>
@@ -1787,7 +1952,7 @@
                     <pic:cNvPicPr/>
                   </pic:nvPicPr>
                   <pic:blipFill>
-                    <a:blip r:embed="rId6"/>
+                    <a:blip r:embed="rId7"/>
                     <a:stretch>
                       <a:fillRect/>
                     </a:stretch>
@@ -2116,7 +2281,7 @@
                     <pic:cNvPicPr/>
                   </pic:nvPicPr>
                   <pic:blipFill>
-                    <a:blip r:embed="rId7">
+                    <a:blip r:embed="rId8">
                       <a:extLst>
                         <a:ext uri="{28A0092B-C50C-407E-A947-70E740481C1C}">
                           <a14:useLocalDpi xmlns:a14="http://schemas.microsoft.com/office/drawing/2010/main" val="0"/>
@@ -2150,7 +2315,7 @@
           <w:rFonts w:cs="Calibri"/>
         </w:rPr>
       </w:pPr>
-      <w:bookmarkStart w:id="1" w:name="_Toc201602563"/>
+      <w:bookmarkStart w:id="1" w:name="_Toc203579028"/>
       <w:r>
         <w:rPr>
           <w:rFonts w:cs="Calibri"/>
@@ -2563,7 +2728,7 @@
                     <pic:cNvPicPr/>
                   </pic:nvPicPr>
                   <pic:blipFill>
-                    <a:blip r:embed="rId8">
+                    <a:blip r:embed="rId9">
                       <a:extLst>
                         <a:ext uri="{28A0092B-C50C-407E-A947-70E740481C1C}">
                           <a14:useLocalDpi xmlns:a14="http://schemas.microsoft.com/office/drawing/2010/main" val="0"/>
@@ -2663,7 +2828,7 @@
                     <pic:cNvPicPr/>
                   </pic:nvPicPr>
                   <pic:blipFill>
-                    <a:blip r:embed="rId9">
+                    <a:blip r:embed="rId10">
                       <a:extLst>
                         <a:ext uri="{28A0092B-C50C-407E-A947-70E740481C1C}">
                           <a14:useLocalDpi xmlns:a14="http://schemas.microsoft.com/office/drawing/2010/main" val="0"/>
@@ -2890,7 +3055,7 @@
                     <pic:cNvPicPr/>
                   </pic:nvPicPr>
                   <pic:blipFill>
-                    <a:blip r:embed="rId10"/>
+                    <a:blip r:embed="rId11"/>
                     <a:stretch>
                       <a:fillRect/>
                     </a:stretch>
@@ -3164,7 +3329,7 @@
                     <pic:cNvPicPr/>
                   </pic:nvPicPr>
                   <pic:blipFill>
-                    <a:blip r:embed="rId11" cstate="print">
+                    <a:blip r:embed="rId12" cstate="print">
                       <a:extLst>
                         <a:ext uri="{28A0092B-C50C-407E-A947-70E740481C1C}">
                           <a14:useLocalDpi xmlns:a14="http://schemas.microsoft.com/office/drawing/2010/main" val="0"/>
@@ -3221,7 +3386,7 @@
                     <pic:cNvPicPr/>
                   </pic:nvPicPr>
                   <pic:blipFill>
-                    <a:blip r:embed="rId12" cstate="print">
+                    <a:blip r:embed="rId13" cstate="print">
                       <a:extLst>
                         <a:ext uri="{28A0092B-C50C-407E-A947-70E740481C1C}">
                           <a14:useLocalDpi xmlns:a14="http://schemas.microsoft.com/office/drawing/2010/main" val="0"/>
@@ -3448,7 +3613,7 @@
                     <pic:cNvPicPr/>
                   </pic:nvPicPr>
                   <pic:blipFill>
-                    <a:blip r:embed="rId13" cstate="print">
+                    <a:blip r:embed="rId14" cstate="print">
                       <a:extLst>
                         <a:ext uri="{28A0092B-C50C-407E-A947-70E740481C1C}">
                           <a14:useLocalDpi xmlns:a14="http://schemas.microsoft.com/office/drawing/2010/main" val="0"/>
@@ -3507,7 +3672,7 @@
                     <pic:cNvPicPr/>
                   </pic:nvPicPr>
                   <pic:blipFill>
-                    <a:blip r:embed="rId14" cstate="print">
+                    <a:blip r:embed="rId15" cstate="print">
                       <a:extLst>
                         <a:ext uri="{28A0092B-C50C-407E-A947-70E740481C1C}">
                           <a14:useLocalDpi xmlns:a14="http://schemas.microsoft.com/office/drawing/2010/main" val="0"/>
@@ -3568,7 +3733,7 @@
           <w:rFonts w:eastAsia="Times New Roman" w:cs="Calibri"/>
         </w:rPr>
       </w:pPr>
-      <w:bookmarkStart w:id="2" w:name="_Toc201602564"/>
+      <w:bookmarkStart w:id="2" w:name="_Toc203579029"/>
       <w:r>
         <w:rPr>
           <w:rFonts w:eastAsia="Times New Roman" w:cs="Calibri"/>
@@ -3671,7 +3836,7 @@
         </w:rPr>
         <w:t xml:space="preserve"> </w:t>
       </w:r>
-      <w:hyperlink r:id="rId15" w:history="1">
+      <w:hyperlink r:id="rId16" w:history="1">
         <w:r>
           <w:rPr>
             <w:rStyle w:val="Hyperlink"/>
@@ -3917,7 +4082,7 @@
                     <pic:cNvPicPr/>
                   </pic:nvPicPr>
                   <pic:blipFill>
-                    <a:blip r:embed="rId16"/>
+                    <a:blip r:embed="rId17"/>
                     <a:stretch>
                       <a:fillRect/>
                     </a:stretch>
@@ -3945,6 +4110,7 @@
           <w:rFonts w:eastAsia="Times New Roman"/>
         </w:rPr>
       </w:pPr>
+      <w:bookmarkStart w:id="3" w:name="_Toc203579030"/>
       <w:r>
         <w:rPr>
           <w:rFonts w:eastAsia="Times New Roman"/>
@@ -3952,6 +4118,7 @@
         <w:lastRenderedPageBreak/>
         <w:t>Alternative Export Methods (e.g., for Adobe Animate)</w:t>
       </w:r>
+      <w:bookmarkEnd w:id="3"/>
     </w:p>
     <w:p>
       <w:pPr>
@@ -4407,7 +4574,7 @@
           <w:rFonts w:eastAsia="Times New Roman" w:cs="Calibri"/>
         </w:rPr>
       </w:pPr>
-      <w:bookmarkStart w:id="3" w:name="_Toc201602565"/>
+      <w:bookmarkStart w:id="4" w:name="_Toc203579031"/>
       <w:r>
         <w:rPr>
           <w:rFonts w:eastAsia="Times New Roman" w:cs="Calibri"/>
@@ -4415,7 +4582,7 @@
         <w:lastRenderedPageBreak/>
         <w:t>Adobe Animate resource preparation</w:t>
       </w:r>
-      <w:bookmarkEnd w:id="3"/>
+      <w:bookmarkEnd w:id="4"/>
     </w:p>
     <w:p>
       <w:pPr>
@@ -4644,14 +4811,14 @@
           <w:rFonts w:cs="Calibri"/>
         </w:rPr>
       </w:pPr>
-      <w:bookmarkStart w:id="4" w:name="_Toc201602566"/>
+      <w:bookmarkStart w:id="5" w:name="_Toc203579032"/>
       <w:r>
         <w:rPr>
           <w:rFonts w:cs="Calibri"/>
         </w:rPr>
         <w:t>Naming Conventions</w:t>
       </w:r>
-      <w:bookmarkEnd w:id="4"/>
+      <w:bookmarkEnd w:id="5"/>
     </w:p>
     <w:p>
       <w:pPr>
@@ -4818,7 +4985,7 @@
                     <pic:cNvPicPr/>
                   </pic:nvPicPr>
                   <pic:blipFill>
-                    <a:blip r:embed="rId17"/>
+                    <a:blip r:embed="rId18"/>
                     <a:stretch>
                       <a:fillRect/>
                     </a:stretch>
@@ -4918,7 +5085,7 @@
                     <pic:cNvPicPr/>
                   </pic:nvPicPr>
                   <pic:blipFill>
-                    <a:blip r:embed="rId18"/>
+                    <a:blip r:embed="rId19"/>
                     <a:stretch>
                       <a:fillRect/>
                     </a:stretch>
@@ -4946,14 +5113,14 @@
           <w:rFonts w:cs="Calibri"/>
         </w:rPr>
       </w:pPr>
-      <w:bookmarkStart w:id="5" w:name="_Toc201602567"/>
+      <w:bookmarkStart w:id="6" w:name="_Toc203579033"/>
       <w:r>
         <w:rPr>
           <w:rFonts w:cs="Calibri"/>
         </w:rPr>
         <w:t>Animation structure</w:t>
       </w:r>
-      <w:bookmarkEnd w:id="5"/>
+      <w:bookmarkEnd w:id="6"/>
     </w:p>
     <w:p>
       <w:pPr>
@@ -5175,7 +5342,7 @@
                     <pic:cNvPicPr/>
                   </pic:nvPicPr>
                   <pic:blipFill>
-                    <a:blip r:embed="rId19"/>
+                    <a:blip r:embed="rId20"/>
                     <a:stretch>
                       <a:fillRect/>
                     </a:stretch>
@@ -5209,7 +5376,7 @@
           <w:rFonts w:cs="Calibri"/>
         </w:rPr>
       </w:pPr>
-      <w:bookmarkStart w:id="6" w:name="_Toc201602568"/>
+      <w:bookmarkStart w:id="7" w:name="_Toc203579034"/>
       <w:r>
         <w:rPr>
           <w:rFonts w:cs="Calibri"/>
@@ -5217,7 +5384,7 @@
         <w:lastRenderedPageBreak/>
         <w:t>Spine resources preparation</w:t>
       </w:r>
-      <w:bookmarkEnd w:id="6"/>
+      <w:bookmarkEnd w:id="7"/>
     </w:p>
     <w:p>
       <w:pPr>
@@ -5226,7 +5393,7 @@
           <w:rFonts w:cs="Calibri"/>
         </w:rPr>
       </w:pPr>
-      <w:bookmarkStart w:id="7" w:name="_Toc201602569"/>
+      <w:bookmarkStart w:id="8" w:name="_Toc203579035"/>
       <w:r>
         <w:rPr>
           <w:rFonts w:cs="Calibri"/>
@@ -5245,7 +5412,7 @@
         </w:rPr>
         <w:t>)</w:t>
       </w:r>
-      <w:bookmarkEnd w:id="7"/>
+      <w:bookmarkEnd w:id="8"/>
     </w:p>
     <w:p>
       <w:pPr>
@@ -5363,7 +5530,7 @@
                     <pic:cNvPicPr/>
                   </pic:nvPicPr>
                   <pic:blipFill>
-                    <a:blip r:embed="rId20"/>
+                    <a:blip r:embed="rId21"/>
                     <a:stretch>
                       <a:fillRect/>
                     </a:stretch>
@@ -5391,14 +5558,14 @@
           <w:rFonts w:cs="Calibri"/>
         </w:rPr>
       </w:pPr>
-      <w:bookmarkStart w:id="8" w:name="_Toc201602570"/>
+      <w:bookmarkStart w:id="9" w:name="_Toc203579036"/>
       <w:r>
         <w:rPr>
           <w:rFonts w:cs="Calibri"/>
         </w:rPr>
         <w:t>Importing PNG Files Manually</w:t>
       </w:r>
-      <w:bookmarkEnd w:id="8"/>
+      <w:bookmarkEnd w:id="9"/>
     </w:p>
     <w:p>
       <w:pPr>
@@ -5492,7 +5659,7 @@
                     <pic:cNvPicPr/>
                   </pic:nvPicPr>
                   <pic:blipFill>
-                    <a:blip r:embed="rId21">
+                    <a:blip r:embed="rId22">
                       <a:extLst>
                         <a:ext uri="{28A0092B-C50C-407E-A947-70E740481C1C}">
                           <a14:useLocalDpi xmlns:a14="http://schemas.microsoft.com/office/drawing/2010/main" val="0"/>
@@ -5558,7 +5725,7 @@
                     <pic:cNvPicPr/>
                   </pic:nvPicPr>
                   <pic:blipFill>
-                    <a:blip r:embed="rId22">
+                    <a:blip r:embed="rId23">
                       <a:extLst>
                         <a:ext uri="{28A0092B-C50C-407E-A947-70E740481C1C}">
                           <a14:useLocalDpi xmlns:a14="http://schemas.microsoft.com/office/drawing/2010/main" val="0"/>
@@ -5600,7 +5767,7 @@
           <w:rFonts w:cs="Calibri"/>
         </w:rPr>
       </w:pPr>
-      <w:bookmarkStart w:id="9" w:name="_Toc201602571"/>
+      <w:bookmarkStart w:id="10" w:name="_Toc203579037"/>
       <w:r>
         <w:rPr>
           <w:rFonts w:cs="Calibri"/>
@@ -5608,7 +5775,7 @@
         <w:lastRenderedPageBreak/>
         <w:t>Image Asset Preparation</w:t>
       </w:r>
-      <w:bookmarkEnd w:id="9"/>
+      <w:bookmarkEnd w:id="10"/>
     </w:p>
     <w:p>
       <w:pPr>
@@ -5676,7 +5843,7 @@
                     <pic:cNvPicPr/>
                   </pic:nvPicPr>
                   <pic:blipFill>
-                    <a:blip r:embed="rId23"/>
+                    <a:blip r:embed="rId24"/>
                     <a:stretch>
                       <a:fillRect/>
                     </a:stretch>
@@ -5771,7 +5938,7 @@
                     <pic:cNvPicPr/>
                   </pic:nvPicPr>
                   <pic:blipFill>
-                    <a:blip r:embed="rId24"/>
+                    <a:blip r:embed="rId25"/>
                     <a:stretch>
                       <a:fillRect/>
                     </a:stretch>
@@ -5975,7 +6142,7 @@
                     <pic:cNvPicPr/>
                   </pic:nvPicPr>
                   <pic:blipFill>
-                    <a:blip r:embed="rId25"/>
+                    <a:blip r:embed="rId26"/>
                     <a:stretch>
                       <a:fillRect/>
                     </a:stretch>
@@ -6003,7 +6170,7 @@
           <w:rFonts w:cs="Calibri"/>
         </w:rPr>
       </w:pPr>
-      <w:bookmarkStart w:id="10" w:name="_Toc201602572"/>
+      <w:bookmarkStart w:id="11" w:name="_Toc203579038"/>
       <w:r>
         <w:rPr>
           <w:rFonts w:cs="Calibri"/>
@@ -6011,7 +6178,7 @@
         <w:lastRenderedPageBreak/>
         <w:t>Matching Image Names to Slots</w:t>
       </w:r>
-      <w:bookmarkEnd w:id="10"/>
+      <w:bookmarkEnd w:id="11"/>
     </w:p>
     <w:p>
       <w:pPr>
@@ -6152,7 +6319,7 @@
                     <pic:cNvPicPr/>
                   </pic:nvPicPr>
                   <pic:blipFill>
-                    <a:blip r:embed="rId26"/>
+                    <a:blip r:embed="rId27"/>
                     <a:stretch>
                       <a:fillRect/>
                     </a:stretch>
@@ -6180,14 +6347,14 @@
           <w:rFonts w:cs="Calibri"/>
         </w:rPr>
       </w:pPr>
-      <w:bookmarkStart w:id="11" w:name="_Toc201602573"/>
+      <w:bookmarkStart w:id="12" w:name="_Toc203579039"/>
       <w:r>
         <w:rPr>
           <w:rFonts w:cs="Calibri"/>
         </w:rPr>
         <w:t>Animate Mode &amp; Keyframes</w:t>
       </w:r>
-      <w:bookmarkEnd w:id="11"/>
+      <w:bookmarkEnd w:id="12"/>
     </w:p>
     <w:p>
       <w:pPr>
@@ -6323,14 +6490,14 @@
           <w:rFonts w:cs="Calibri"/>
         </w:rPr>
       </w:pPr>
-      <w:bookmarkStart w:id="12" w:name="_Toc201602574"/>
+      <w:bookmarkStart w:id="13" w:name="_Toc203579040"/>
       <w:r>
         <w:rPr>
           <w:rFonts w:cs="Calibri"/>
         </w:rPr>
         <w:t>Keyframe Rules</w:t>
       </w:r>
-      <w:bookmarkEnd w:id="12"/>
+      <w:bookmarkEnd w:id="13"/>
     </w:p>
     <w:p>
       <w:pPr>
@@ -6590,7 +6757,7 @@
                     <pic:cNvPicPr/>
                   </pic:nvPicPr>
                   <pic:blipFill>
-                    <a:blip r:embed="rId27">
+                    <a:blip r:embed="rId28">
                       <a:extLst>
                         <a:ext uri="{28A0092B-C50C-407E-A947-70E740481C1C}">
                           <a14:useLocalDpi xmlns:a14="http://schemas.microsoft.com/office/drawing/2010/main" val="0"/>
@@ -6654,7 +6821,7 @@
                     <pic:cNvPicPr/>
                   </pic:nvPicPr>
                   <pic:blipFill>
-                    <a:blip r:embed="rId28">
+                    <a:blip r:embed="rId29">
                       <a:extLst>
                         <a:ext uri="{28A0092B-C50C-407E-A947-70E740481C1C}">
                           <a14:useLocalDpi xmlns:a14="http://schemas.microsoft.com/office/drawing/2010/main" val="0"/>
@@ -6722,7 +6889,7 @@
           <w:rFonts w:cs="Calibri"/>
         </w:rPr>
       </w:pPr>
-      <w:bookmarkStart w:id="13" w:name="_Toc201602575"/>
+      <w:bookmarkStart w:id="14" w:name="_Toc203579041"/>
       <w:r>
         <w:rPr>
           <w:rFonts w:cs="Calibri"/>
@@ -6730,7 +6897,7 @@
         <w:lastRenderedPageBreak/>
         <w:t>Rigging Bones</w:t>
       </w:r>
-      <w:bookmarkEnd w:id="13"/>
+      <w:bookmarkEnd w:id="14"/>
     </w:p>
     <w:p>
       <w:pPr>
@@ -6833,7 +7000,7 @@
                     <pic:cNvPicPr/>
                   </pic:nvPicPr>
                   <pic:blipFill>
-                    <a:blip r:embed="rId29">
+                    <a:blip r:embed="rId30">
                       <a:extLst>
                         <a:ext uri="{28A0092B-C50C-407E-A947-70E740481C1C}">
                           <a14:useLocalDpi xmlns:a14="http://schemas.microsoft.com/office/drawing/2010/main" val="0"/>
@@ -6896,7 +7063,7 @@
                     <pic:cNvPicPr/>
                   </pic:nvPicPr>
                   <pic:blipFill>
-                    <a:blip r:embed="rId30">
+                    <a:blip r:embed="rId31">
                       <a:extLst>
                         <a:ext uri="{28A0092B-C50C-407E-A947-70E740481C1C}">
                           <a14:useLocalDpi xmlns:a14="http://schemas.microsoft.com/office/drawing/2010/main" val="0"/>
@@ -7210,7 +7377,7 @@
           <w:rFonts w:cs="Calibri"/>
         </w:rPr>
       </w:pPr>
-      <w:bookmarkStart w:id="14" w:name="_Toc201602576"/>
+      <w:bookmarkStart w:id="15" w:name="_Toc203579042"/>
       <w:r>
         <w:rPr>
           <w:rFonts w:cs="Calibri"/>
@@ -7218,7 +7385,7 @@
         <w:lastRenderedPageBreak/>
         <w:t>Export Settings</w:t>
       </w:r>
-      <w:bookmarkEnd w:id="14"/>
+      <w:bookmarkEnd w:id="15"/>
     </w:p>
     <w:p>
       <w:pPr>
@@ -7371,7 +7538,7 @@
                     <pic:cNvPicPr/>
                   </pic:nvPicPr>
                   <pic:blipFill>
-                    <a:blip r:embed="rId31"/>
+                    <a:blip r:embed="rId32"/>
                     <a:stretch>
                       <a:fillRect/>
                     </a:stretch>
@@ -7399,14 +7566,14 @@
           <w:rFonts w:cs="Calibri"/>
         </w:rPr>
       </w:pPr>
-      <w:bookmarkStart w:id="15" w:name="_Toc201602577"/>
+      <w:bookmarkStart w:id="16" w:name="_Toc203579043"/>
       <w:r>
         <w:rPr>
           <w:rFonts w:cs="Calibri"/>
         </w:rPr>
         <w:t>Data:</w:t>
       </w:r>
-      <w:bookmarkEnd w:id="15"/>
+      <w:bookmarkEnd w:id="16"/>
     </w:p>
     <w:p>
       <w:pPr>
@@ -7476,7 +7643,23 @@
           <w:rFonts w:ascii="Calibri" w:hAnsi="Calibri" w:cs="Calibri"/>
           <w:color w:val="000000" w:themeColor="text1"/>
         </w:rPr>
-        <w:t>where will be located .json file of project</w:t>
+        <w:t xml:space="preserve">where will be located </w:t>
+      </w:r>
+      <w:r>
+        <w:rPr>
+          <w:rFonts w:ascii="Calibri" w:hAnsi="Calibri" w:cs="Calibri"/>
+          <w:i/>
+          <w:iCs/>
+          <w:color w:val="000000" w:themeColor="text1"/>
+        </w:rPr>
+        <w:t>.json</w:t>
+      </w:r>
+      <w:r>
+        <w:rPr>
+          <w:rFonts w:ascii="Calibri" w:hAnsi="Calibri" w:cs="Calibri"/>
+          <w:color w:val="000000" w:themeColor="text1"/>
+        </w:rPr>
+        <w:t xml:space="preserve"> file of project</w:t>
       </w:r>
       <w:r>
         <w:rPr>
@@ -7509,14 +7692,14 @@
           <w:rFonts w:cs="Calibri"/>
         </w:rPr>
       </w:pPr>
-      <w:bookmarkStart w:id="16" w:name="_Toc201602578"/>
+      <w:bookmarkStart w:id="17" w:name="_Toc203579044"/>
       <w:r>
         <w:rPr>
           <w:rFonts w:cs="Calibri"/>
         </w:rPr>
         <w:t>Image or Video:</w:t>
       </w:r>
-      <w:bookmarkEnd w:id="16"/>
+      <w:bookmarkEnd w:id="17"/>
     </w:p>
     <w:p>
       <w:pPr>
@@ -7557,45 +7740,31 @@
           <w:rFonts w:cs="Calibri"/>
         </w:rPr>
       </w:pPr>
-      <w:bookmarkStart w:id="17" w:name="_Toc201602579"/>
+      <w:bookmarkStart w:id="18" w:name="_Toc203579045"/>
       <w:r>
         <w:rPr>
           <w:rFonts w:cs="Calibri"/>
         </w:rPr>
         <w:lastRenderedPageBreak/>
-        <w:t xml:space="preserve">Sprite sheet creation in </w:t>
-      </w:r>
-      <w:proofErr w:type="spellStart"/>
-      <w:r>
+        <w:t>Sprite sheet creation in TexturePacker GUI</w:t>
+      </w:r>
+      <w:bookmarkEnd w:id="18"/>
+    </w:p>
+    <w:p>
+      <w:pPr>
+        <w:pStyle w:val="Heading2"/>
         <w:rPr>
           <w:rFonts w:cs="Calibri"/>
         </w:rPr>
-        <w:t>TexturePacker</w:t>
-      </w:r>
-      <w:proofErr w:type="spellEnd"/>
+      </w:pPr>
+      <w:bookmarkStart w:id="19" w:name="_Toc203579046"/>
       <w:r>
         <w:rPr>
           <w:rFonts w:cs="Calibri"/>
         </w:rPr>
-        <w:t xml:space="preserve"> GUI</w:t>
-      </w:r>
-      <w:bookmarkEnd w:id="17"/>
-    </w:p>
-    <w:p>
-      <w:pPr>
-        <w:pStyle w:val="Heading2"/>
-        <w:rPr>
-          <w:rFonts w:cs="Calibri"/>
-        </w:rPr>
-      </w:pPr>
-      <w:bookmarkStart w:id="18" w:name="_Toc201602580"/>
-      <w:r>
-        <w:rPr>
-          <w:rFonts w:cs="Calibri"/>
-        </w:rPr>
         <w:t>Adding new sprites</w:t>
       </w:r>
-      <w:bookmarkEnd w:id="18"/>
+      <w:bookmarkEnd w:id="19"/>
     </w:p>
     <w:p>
       <w:pPr>
@@ -7679,7 +7848,7 @@
                     <pic:cNvPicPr/>
                   </pic:nvPicPr>
                   <pic:blipFill>
-                    <a:blip r:embed="rId32"/>
+                    <a:blip r:embed="rId33"/>
                     <a:stretch>
                       <a:fillRect/>
                     </a:stretch>
@@ -7707,14 +7876,14 @@
           <w:rFonts w:cs="Calibri"/>
         </w:rPr>
       </w:pPr>
-      <w:bookmarkStart w:id="19" w:name="_Toc201602581"/>
+      <w:bookmarkStart w:id="20" w:name="_Toc203579047"/>
       <w:r>
         <w:rPr>
           <w:rFonts w:cs="Calibri"/>
         </w:rPr>
         <w:t>Sprite settings</w:t>
       </w:r>
-      <w:bookmarkEnd w:id="19"/>
+      <w:bookmarkEnd w:id="20"/>
     </w:p>
     <w:p>
       <w:pPr>
@@ -7785,7 +7954,7 @@
                     <pic:cNvPicPr/>
                   </pic:nvPicPr>
                   <pic:blipFill>
-                    <a:blip r:embed="rId33"/>
+                    <a:blip r:embed="rId34"/>
                     <a:stretch>
                       <a:fillRect/>
                     </a:stretch>
@@ -7864,7 +8033,7 @@
                     <pic:cNvPicPr/>
                   </pic:nvPicPr>
                   <pic:blipFill>
-                    <a:blip r:embed="rId34"/>
+                    <a:blip r:embed="rId35"/>
                     <a:stretch>
                       <a:fillRect/>
                     </a:stretch>
@@ -7961,7 +8130,7 @@
                     <pic:cNvPicPr/>
                   </pic:nvPicPr>
                   <pic:blipFill>
-                    <a:blip r:embed="rId35"/>
+                    <a:blip r:embed="rId36"/>
                     <a:stretch>
                       <a:fillRect/>
                     </a:stretch>
@@ -8003,7 +8172,7 @@
                     <pic:cNvPicPr/>
                   </pic:nvPicPr>
                   <pic:blipFill>
-                    <a:blip r:embed="rId36"/>
+                    <a:blip r:embed="rId37"/>
                     <a:stretch>
                       <a:fillRect/>
                     </a:stretch>
@@ -8031,7 +8200,7 @@
           <w:rFonts w:cs="Calibri"/>
         </w:rPr>
       </w:pPr>
-      <w:bookmarkStart w:id="20" w:name="_Toc201602582"/>
+      <w:bookmarkStart w:id="21" w:name="_Toc203579048"/>
       <w:r>
         <w:rPr>
           <w:rFonts w:cs="Calibri"/>
@@ -8039,7 +8208,7 @@
         <w:lastRenderedPageBreak/>
         <w:t>Export settings</w:t>
       </w:r>
-      <w:bookmarkEnd w:id="20"/>
+      <w:bookmarkEnd w:id="21"/>
     </w:p>
     <w:p>
       <w:pPr>
@@ -8075,7 +8244,7 @@
                     <pic:cNvPicPr/>
                   </pic:nvPicPr>
                   <pic:blipFill>
-                    <a:blip r:embed="rId37"/>
+                    <a:blip r:embed="rId38"/>
                     <a:stretch>
                       <a:fillRect/>
                     </a:stretch>
@@ -8126,7 +8295,7 @@
           <w:rFonts w:cs="Calibri"/>
         </w:rPr>
       </w:pPr>
-      <w:bookmarkStart w:id="21" w:name="_Toc201602583"/>
+      <w:bookmarkStart w:id="22" w:name="_Toc203579049"/>
       <w:r>
         <w:rPr>
           <w:rFonts w:cs="Calibri"/>
@@ -8134,7 +8303,7 @@
         <w:lastRenderedPageBreak/>
         <w:t>Output files</w:t>
       </w:r>
-      <w:bookmarkEnd w:id="21"/>
+      <w:bookmarkEnd w:id="22"/>
     </w:p>
     <w:p>
       <w:pPr>
@@ -8174,7 +8343,7 @@
                     <pic:cNvPicPr/>
                   </pic:nvPicPr>
                   <pic:blipFill>
-                    <a:blip r:embed="rId38"/>
+                    <a:blip r:embed="rId39"/>
                     <a:stretch>
                       <a:fillRect/>
                     </a:stretch>
@@ -8247,7 +8416,32 @@
           <w:rFonts w:ascii="Calibri" w:hAnsi="Calibri" w:cs="Calibri"/>
           <w:color w:val="000000" w:themeColor="text1"/>
         </w:rPr>
-        <w:t xml:space="preserve">Set path where will be saved .JSON file of sprite sheet </w:t>
+        <w:t xml:space="preserve">Set path where will be saved </w:t>
+      </w:r>
+      <w:r>
+        <w:rPr>
+          <w:rFonts w:ascii="Calibri" w:hAnsi="Calibri" w:cs="Calibri"/>
+          <w:i/>
+          <w:iCs/>
+          <w:color w:val="000000" w:themeColor="text1"/>
+        </w:rPr>
+        <w:t>.</w:t>
+      </w:r>
+      <w:r>
+        <w:rPr>
+          <w:rFonts w:ascii="Calibri" w:hAnsi="Calibri" w:cs="Calibri"/>
+          <w:i/>
+          <w:iCs/>
+          <w:color w:val="000000" w:themeColor="text1"/>
+        </w:rPr>
+        <w:t>json</w:t>
+      </w:r>
+      <w:r>
+        <w:rPr>
+          <w:rFonts w:ascii="Calibri" w:hAnsi="Calibri" w:cs="Calibri"/>
+          <w:color w:val="000000" w:themeColor="text1"/>
+        </w:rPr>
+        <w:t xml:space="preserve"> file of sprite sheet </w:t>
       </w:r>
     </w:p>
     <w:p>
@@ -8257,14 +8451,14 @@
           <w:rFonts w:cs="Calibri"/>
         </w:rPr>
       </w:pPr>
-      <w:bookmarkStart w:id="22" w:name="_Toc201602584"/>
+      <w:bookmarkStart w:id="23" w:name="_Toc203579050"/>
       <w:r>
         <w:rPr>
           <w:rFonts w:cs="Calibri"/>
         </w:rPr>
         <w:t>Image format</w:t>
       </w:r>
-      <w:bookmarkEnd w:id="22"/>
+      <w:bookmarkEnd w:id="23"/>
     </w:p>
     <w:p>
       <w:pPr>
@@ -8304,7 +8498,7 @@
                     <pic:cNvPicPr/>
                   </pic:nvPicPr>
                   <pic:blipFill>
-                    <a:blip r:embed="rId39"/>
+                    <a:blip r:embed="rId40"/>
                     <a:stretch>
                       <a:fillRect/>
                     </a:stretch>
@@ -8403,7 +8597,7 @@
           <w:rFonts w:cs="Calibri"/>
         </w:rPr>
       </w:pPr>
-      <w:bookmarkStart w:id="23" w:name="_Toc201602585"/>
+      <w:bookmarkStart w:id="24" w:name="_Toc203579051"/>
       <w:r>
         <w:rPr>
           <w:rFonts w:cs="Calibri"/>
@@ -8411,7 +8605,7 @@
         <w:lastRenderedPageBreak/>
         <w:t>Packing</w:t>
       </w:r>
-      <w:bookmarkEnd w:id="23"/>
+      <w:bookmarkEnd w:id="24"/>
     </w:p>
     <w:p>
       <w:pPr>
@@ -8451,7 +8645,7 @@
                     <pic:cNvPicPr/>
                   </pic:nvPicPr>
                   <pic:blipFill>
-                    <a:blip r:embed="rId40"/>
+                    <a:blip r:embed="rId41"/>
                     <a:stretch>
                       <a:fillRect/>
                     </a:stretch>
@@ -8620,7 +8814,7 @@
           <w:rFonts w:cs="Calibri"/>
         </w:rPr>
       </w:pPr>
-      <w:bookmarkStart w:id="24" w:name="_Toc201602586"/>
+      <w:bookmarkStart w:id="25" w:name="_Toc203579052"/>
       <w:r>
         <w:rPr>
           <w:rFonts w:cs="Calibri"/>
@@ -8628,7 +8822,7 @@
         <w:lastRenderedPageBreak/>
         <w:t>Publishing a Sprite Sheet</w:t>
       </w:r>
-      <w:bookmarkEnd w:id="24"/>
+      <w:bookmarkEnd w:id="25"/>
     </w:p>
     <w:p>
       <w:pPr>
@@ -8675,7 +8869,32 @@
           <w:rFonts w:ascii="Calibri" w:hAnsi="Calibri" w:cs="Calibri"/>
           <w:color w:val="000000" w:themeColor="text1"/>
         </w:rPr>
-        <w:t>and in folder that selected, will be .JSON file and PNG of textures</w:t>
+        <w:t xml:space="preserve">and in folder that selected, will be </w:t>
+      </w:r>
+      <w:r>
+        <w:rPr>
+          <w:rFonts w:ascii="Calibri" w:hAnsi="Calibri" w:cs="Calibri"/>
+          <w:i/>
+          <w:iCs/>
+          <w:color w:val="000000" w:themeColor="text1"/>
+        </w:rPr>
+        <w:t>.</w:t>
+      </w:r>
+      <w:r>
+        <w:rPr>
+          <w:rFonts w:ascii="Calibri" w:hAnsi="Calibri" w:cs="Calibri"/>
+          <w:i/>
+          <w:iCs/>
+          <w:color w:val="000000" w:themeColor="text1"/>
+        </w:rPr>
+        <w:t>json</w:t>
+      </w:r>
+      <w:r>
+        <w:rPr>
+          <w:rFonts w:ascii="Calibri" w:hAnsi="Calibri" w:cs="Calibri"/>
+          <w:color w:val="000000" w:themeColor="text1"/>
+        </w:rPr>
+        <w:t xml:space="preserve"> file and PNG of textures</w:t>
       </w:r>
     </w:p>
     <w:p>
@@ -8708,7 +8927,7 @@
                     <pic:cNvPicPr/>
                   </pic:nvPicPr>
                   <pic:blipFill>
-                    <a:blip r:embed="rId41"/>
+                    <a:blip r:embed="rId42"/>
                     <a:stretch>
                       <a:fillRect/>
                     </a:stretch>
@@ -8759,7 +8978,7 @@
                     <pic:cNvPicPr/>
                   </pic:nvPicPr>
                   <pic:blipFill>
-                    <a:blip r:embed="rId42"/>
+                    <a:blip r:embed="rId43"/>
                     <a:stretch>
                       <a:fillRect/>
                     </a:stretch>

</xml_diff>